<commit_message>
some ms word files includeand some dsa questions
</commit_message>
<xml_diff>
--- a/interview questions/5.node.js.docx
+++ b/interview questions/5.node.js.docx
@@ -5,6 +5,7 @@
     <w:p>
       <w:pPr>
         <w:spacing w:line="240" w:lineRule="auto"/>
+        <w:jc w:val="both"/>
         <w:rPr>
           <w:b/>
           <w:bCs/>
@@ -21,6 +22,7 @@
     <w:p>
       <w:pPr>
         <w:spacing w:line="240" w:lineRule="auto"/>
+        <w:jc w:val="both"/>
       </w:pPr>
       <w:r>
         <w:rPr>
@@ -47,6 +49,7 @@
     <w:p>
       <w:pPr>
         <w:spacing w:line="240" w:lineRule="auto"/>
+        <w:jc w:val="both"/>
       </w:pPr>
       <w:r>
         <w:t xml:space="preserve">It is built on </w:t>
@@ -65,6 +68,7 @@
     <w:p>
       <w:pPr>
         <w:spacing w:line="240" w:lineRule="auto"/>
+        <w:jc w:val="both"/>
       </w:pPr>
       <w:r>
         <w:rPr>
@@ -77,6 +81,7 @@
     <w:p>
       <w:pPr>
         <w:spacing w:line="240" w:lineRule="auto"/>
+        <w:jc w:val="both"/>
       </w:pPr>
       <w:proofErr w:type="gramStart"/>
       <w:r>
@@ -90,16 +95,18 @@
     <w:p>
       <w:pPr>
         <w:spacing w:line="240" w:lineRule="auto"/>
+        <w:jc w:val="both"/>
       </w:pPr>
       <w:r>
         <w:pict w14:anchorId="3EF6F3C1">
-          <v:rect id="_x0000_i1085" style="width:0;height:1.5pt" o:hralign="center" o:hrstd="t" o:hr="t" fillcolor="#a0a0a0" stroked="f"/>
+          <v:rect id="_x0000_i1025" style="width:0;height:1.5pt" o:hralign="center" o:hrstd="t" o:hr="t" fillcolor="#a0a0a0" stroked="f"/>
         </w:pict>
       </w:r>
     </w:p>
     <w:p>
       <w:pPr>
         <w:spacing w:line="240" w:lineRule="auto"/>
+        <w:jc w:val="both"/>
         <w:rPr>
           <w:b/>
           <w:bCs/>
@@ -116,6 +123,7 @@
     <w:p>
       <w:pPr>
         <w:spacing w:line="240" w:lineRule="auto"/>
+        <w:jc w:val="both"/>
       </w:pPr>
       <w:r>
         <w:rPr>
@@ -155,6 +163,7 @@
           <w:p>
             <w:pPr>
               <w:spacing w:line="240" w:lineRule="auto"/>
+              <w:jc w:val="both"/>
               <w:rPr>
                 <w:b/>
                 <w:bCs/>
@@ -178,6 +187,7 @@
           <w:p>
             <w:pPr>
               <w:spacing w:line="240" w:lineRule="auto"/>
+              <w:jc w:val="both"/>
               <w:rPr>
                 <w:b/>
                 <w:bCs/>
@@ -206,6 +216,7 @@
           <w:p>
             <w:pPr>
               <w:spacing w:line="240" w:lineRule="auto"/>
+              <w:jc w:val="both"/>
             </w:pPr>
             <w:r>
               <w:t>Programming language</w:t>
@@ -221,6 +232,7 @@
           <w:p>
             <w:pPr>
               <w:spacing w:line="240" w:lineRule="auto"/>
+              <w:jc w:val="both"/>
             </w:pPr>
             <w:r>
               <w:t>JavaScript runtime environment</w:t>
@@ -241,6 +253,7 @@
           <w:p>
             <w:pPr>
               <w:spacing w:line="240" w:lineRule="auto"/>
+              <w:jc w:val="both"/>
             </w:pPr>
             <w:r>
               <w:t>Mainly runs in browsers</w:t>
@@ -256,6 +269,7 @@
           <w:p>
             <w:pPr>
               <w:spacing w:line="240" w:lineRule="auto"/>
+              <w:jc w:val="both"/>
             </w:pPr>
             <w:r>
               <w:t>Runs outside the browser</w:t>
@@ -276,6 +290,7 @@
           <w:p>
             <w:pPr>
               <w:spacing w:line="240" w:lineRule="auto"/>
+              <w:jc w:val="both"/>
             </w:pPr>
             <w:r>
               <w:t>Can access DOM</w:t>
@@ -291,6 +306,7 @@
           <w:p>
             <w:pPr>
               <w:spacing w:line="240" w:lineRule="auto"/>
+              <w:jc w:val="both"/>
             </w:pPr>
             <w:r>
               <w:t>No DOM by default</w:t>
@@ -311,6 +327,7 @@
           <w:p>
             <w:pPr>
               <w:spacing w:line="240" w:lineRule="auto"/>
+              <w:jc w:val="both"/>
             </w:pPr>
             <w:r>
               <w:t>Used for frontend</w:t>
@@ -326,6 +343,7 @@
           <w:p>
             <w:pPr>
               <w:spacing w:line="240" w:lineRule="auto"/>
+              <w:jc w:val="both"/>
             </w:pPr>
             <w:r>
               <w:t>Commonly used for backend</w:t>
@@ -346,6 +364,7 @@
           <w:p>
             <w:pPr>
               <w:spacing w:line="240" w:lineRule="auto"/>
+              <w:jc w:val="both"/>
             </w:pPr>
             <w:r>
               <w:t>Browser APIs are available</w:t>
@@ -361,6 +380,7 @@
           <w:p>
             <w:pPr>
               <w:spacing w:line="240" w:lineRule="auto"/>
+              <w:jc w:val="both"/>
             </w:pPr>
             <w:r>
               <w:t>Node.js APIs are available</w:t>
@@ -372,6 +392,7 @@
     <w:p>
       <w:pPr>
         <w:spacing w:line="240" w:lineRule="auto"/>
+        <w:jc w:val="both"/>
       </w:pPr>
       <w:r>
         <w:rPr>
@@ -384,6 +405,7 @@
     <w:p>
       <w:pPr>
         <w:spacing w:line="240" w:lineRule="auto"/>
+        <w:jc w:val="both"/>
       </w:pPr>
       <w:r>
         <w:t>JavaScript is a programming language, while Node.js is a runtime environment that allows JavaScript to run outside the browser.</w:t>
@@ -392,16 +414,18 @@
     <w:p>
       <w:pPr>
         <w:spacing w:line="240" w:lineRule="auto"/>
+        <w:jc w:val="both"/>
       </w:pPr>
       <w:r>
         <w:pict w14:anchorId="22F20C48">
-          <v:rect id="_x0000_i1086" style="width:0;height:1.5pt" o:hralign="center" o:hrstd="t" o:hr="t" fillcolor="#a0a0a0" stroked="f"/>
+          <v:rect id="_x0000_i1026" style="width:0;height:1.5pt" o:hralign="center" o:hrstd="t" o:hr="t" fillcolor="#a0a0a0" stroked="f"/>
         </w:pict>
       </w:r>
     </w:p>
     <w:p>
       <w:pPr>
         <w:spacing w:line="240" w:lineRule="auto"/>
+        <w:jc w:val="both"/>
         <w:rPr>
           <w:b/>
           <w:bCs/>
@@ -418,6 +442,7 @@
     <w:p>
       <w:pPr>
         <w:spacing w:line="240" w:lineRule="auto"/>
+        <w:jc w:val="both"/>
       </w:pPr>
       <w:r>
         <w:rPr>
@@ -438,6 +463,7 @@
           <w:numId w:val="5"/>
         </w:numPr>
         <w:spacing w:line="240" w:lineRule="auto"/>
+        <w:jc w:val="both"/>
       </w:pPr>
       <w:r>
         <w:rPr>
@@ -457,6 +483,7 @@
           <w:numId w:val="5"/>
         </w:numPr>
         <w:spacing w:line="240" w:lineRule="auto"/>
+        <w:jc w:val="both"/>
       </w:pPr>
       <w:r>
         <w:rPr>
@@ -476,6 +503,7 @@
           <w:numId w:val="5"/>
         </w:numPr>
         <w:spacing w:line="240" w:lineRule="auto"/>
+        <w:jc w:val="both"/>
       </w:pPr>
       <w:r>
         <w:rPr>
@@ -495,6 +523,7 @@
           <w:numId w:val="5"/>
         </w:numPr>
         <w:spacing w:line="240" w:lineRule="auto"/>
+        <w:jc w:val="both"/>
       </w:pPr>
       <w:r>
         <w:rPr>
@@ -514,6 +543,7 @@
           <w:numId w:val="5"/>
         </w:numPr>
         <w:spacing w:line="240" w:lineRule="auto"/>
+        <w:jc w:val="both"/>
       </w:pPr>
       <w:r>
         <w:rPr>
@@ -529,6 +559,7 @@
     <w:p>
       <w:pPr>
         <w:spacing w:line="240" w:lineRule="auto"/>
+        <w:jc w:val="both"/>
       </w:pPr>
       <w:r>
         <w:t>Instead of waiting for an I/O operation such as a database query to finish, Node.js can continue processing other requests.</w:t>
@@ -537,16 +568,18 @@
     <w:p>
       <w:pPr>
         <w:spacing w:line="240" w:lineRule="auto"/>
+        <w:jc w:val="both"/>
       </w:pPr>
       <w:r>
         <w:pict w14:anchorId="3ACDDF7A">
-          <v:rect id="_x0000_i1087" style="width:0;height:1.5pt" o:hralign="center" o:hrstd="t" o:hr="t" fillcolor="#a0a0a0" stroked="f"/>
+          <v:rect id="_x0000_i1027" style="width:0;height:1.5pt" o:hralign="center" o:hrstd="t" o:hr="t" fillcolor="#a0a0a0" stroked="f"/>
         </w:pict>
       </w:r>
     </w:p>
     <w:p>
       <w:pPr>
         <w:spacing w:line="240" w:lineRule="auto"/>
+        <w:jc w:val="both"/>
         <w:rPr>
           <w:b/>
           <w:bCs/>
@@ -564,6 +597,7 @@
     <w:p>
       <w:pPr>
         <w:spacing w:line="240" w:lineRule="auto"/>
+        <w:jc w:val="both"/>
       </w:pPr>
       <w:r>
         <w:rPr>
@@ -600,6 +634,7 @@
     <w:p>
       <w:pPr>
         <w:spacing w:line="240" w:lineRule="auto"/>
+        <w:jc w:val="both"/>
       </w:pPr>
       <w:r>
         <w:t>For example:</w:t>
@@ -608,6 +643,7 @@
     <w:p>
       <w:pPr>
         <w:spacing w:line="240" w:lineRule="auto"/>
+        <w:jc w:val="both"/>
       </w:pPr>
       <w:r>
         <w:t>console.log("Start");</w:t>
@@ -616,11 +652,13 @@
     <w:p>
       <w:pPr>
         <w:spacing w:line="240" w:lineRule="auto"/>
-      </w:pPr>
-    </w:p>
-    <w:p>
-      <w:pPr>
-        <w:spacing w:line="240" w:lineRule="auto"/>
+        <w:jc w:val="both"/>
+      </w:pPr>
+    </w:p>
+    <w:p>
+      <w:pPr>
+        <w:spacing w:line="240" w:lineRule="auto"/>
+        <w:jc w:val="both"/>
       </w:pPr>
       <w:proofErr w:type="spellStart"/>
       <w:proofErr w:type="gramStart"/>
@@ -639,6 +677,7 @@
     <w:p>
       <w:pPr>
         <w:spacing w:line="240" w:lineRule="auto"/>
+        <w:jc w:val="both"/>
       </w:pPr>
       <w:r>
         <w:t xml:space="preserve">    console.log("Timer");</w:t>
@@ -647,6 +686,7 @@
     <w:p>
       <w:pPr>
         <w:spacing w:line="240" w:lineRule="auto"/>
+        <w:jc w:val="both"/>
       </w:pPr>
       <w:r>
         <w:t>}, 2000);</w:t>
@@ -655,11 +695,13 @@
     <w:p>
       <w:pPr>
         <w:spacing w:line="240" w:lineRule="auto"/>
-      </w:pPr>
-    </w:p>
-    <w:p>
-      <w:pPr>
-        <w:spacing w:line="240" w:lineRule="auto"/>
+        <w:jc w:val="both"/>
+      </w:pPr>
+    </w:p>
+    <w:p>
+      <w:pPr>
+        <w:spacing w:line="240" w:lineRule="auto"/>
+        <w:jc w:val="both"/>
       </w:pPr>
       <w:r>
         <w:t>console.log("End");</w:t>
@@ -668,6 +710,7 @@
     <w:p>
       <w:pPr>
         <w:spacing w:line="240" w:lineRule="auto"/>
+        <w:jc w:val="both"/>
       </w:pPr>
       <w:r>
         <w:rPr>
@@ -680,6 +723,7 @@
     <w:p>
       <w:pPr>
         <w:spacing w:line="240" w:lineRule="auto"/>
+        <w:jc w:val="both"/>
       </w:pPr>
       <w:r>
         <w:t>Start</w:t>
@@ -688,6 +732,7 @@
     <w:p>
       <w:pPr>
         <w:spacing w:line="240" w:lineRule="auto"/>
+        <w:jc w:val="both"/>
       </w:pPr>
       <w:r>
         <w:t>End</w:t>
@@ -696,6 +741,7 @@
     <w:p>
       <w:pPr>
         <w:spacing w:line="240" w:lineRule="auto"/>
+        <w:jc w:val="both"/>
       </w:pPr>
       <w:r>
         <w:t>Timer</w:t>
@@ -704,6 +750,7 @@
     <w:p>
       <w:pPr>
         <w:spacing w:line="240" w:lineRule="auto"/>
+        <w:jc w:val="both"/>
       </w:pPr>
       <w:r>
         <w:t>The timer doesn't block the execution of the remaining code.</w:t>
@@ -712,16 +759,18 @@
     <w:p>
       <w:pPr>
         <w:spacing w:line="240" w:lineRule="auto"/>
+        <w:jc w:val="both"/>
       </w:pPr>
       <w:r>
         <w:pict w14:anchorId="07032371">
-          <v:rect id="_x0000_i1088" style="width:0;height:1.5pt" o:hralign="center" o:hrstd="t" o:hr="t" fillcolor="#a0a0a0" stroked="f"/>
+          <v:rect id="_x0000_i1028" style="width:0;height:1.5pt" o:hralign="center" o:hrstd="t" o:hr="t" fillcolor="#a0a0a0" stroked="f"/>
         </w:pict>
       </w:r>
     </w:p>
     <w:p>
       <w:pPr>
         <w:spacing w:line="240" w:lineRule="auto"/>
+        <w:jc w:val="both"/>
         <w:rPr>
           <w:b/>
           <w:bCs/>
@@ -754,6 +803,7 @@
     <w:p>
       <w:pPr>
         <w:spacing w:line="240" w:lineRule="auto"/>
+        <w:jc w:val="both"/>
       </w:pPr>
       <w:r>
         <w:rPr>
@@ -788,6 +838,7 @@
     <w:p>
       <w:pPr>
         <w:spacing w:line="240" w:lineRule="auto"/>
+        <w:jc w:val="both"/>
       </w:pPr>
       <w:r>
         <w:t>It is used to:</w:t>
@@ -800,6 +851,7 @@
           <w:numId w:val="6"/>
         </w:numPr>
         <w:spacing w:line="240" w:lineRule="auto"/>
+        <w:jc w:val="both"/>
       </w:pPr>
       <w:r>
         <w:t xml:space="preserve">Install packages </w:t>
@@ -812,6 +864,7 @@
           <w:numId w:val="6"/>
         </w:numPr>
         <w:spacing w:line="240" w:lineRule="auto"/>
+        <w:jc w:val="both"/>
       </w:pPr>
       <w:r>
         <w:t xml:space="preserve">Manage dependencies </w:t>
@@ -824,6 +877,7 @@
           <w:numId w:val="6"/>
         </w:numPr>
         <w:spacing w:line="240" w:lineRule="auto"/>
+        <w:jc w:val="both"/>
       </w:pPr>
       <w:r>
         <w:t xml:space="preserve">Create projects </w:t>
@@ -836,6 +890,7 @@
           <w:numId w:val="6"/>
         </w:numPr>
         <w:spacing w:line="240" w:lineRule="auto"/>
+        <w:jc w:val="both"/>
       </w:pPr>
       <w:r>
         <w:t xml:space="preserve">Run scripts </w:t>
@@ -857,6 +912,7 @@
     <w:p>
       <w:pPr>
         <w:spacing w:line="240" w:lineRule="auto"/>
+        <w:jc w:val="both"/>
       </w:pPr>
       <w:r>
         <w:rPr>
@@ -869,6 +925,7 @@
     <w:p>
       <w:pPr>
         <w:spacing w:line="240" w:lineRule="auto"/>
+        <w:jc w:val="both"/>
       </w:pPr>
       <w:proofErr w:type="spellStart"/>
       <w:r>
@@ -890,6 +947,7 @@
     <w:p>
       <w:pPr>
         <w:spacing w:line="240" w:lineRule="auto"/>
+        <w:jc w:val="both"/>
       </w:pPr>
       <w:r>
         <w:t>Install Express:</w:t>
@@ -898,6 +956,7 @@
     <w:p>
       <w:pPr>
         <w:spacing w:line="240" w:lineRule="auto"/>
+        <w:jc w:val="both"/>
       </w:pPr>
       <w:proofErr w:type="spellStart"/>
       <w:r>
@@ -911,16 +970,18 @@
     <w:p>
       <w:pPr>
         <w:spacing w:line="240" w:lineRule="auto"/>
+        <w:jc w:val="both"/>
       </w:pPr>
       <w:r>
         <w:pict w14:anchorId="1E734A8B">
-          <v:rect id="_x0000_i1089" style="width:0;height:1.5pt" o:hralign="center" o:hrstd="t" o:hr="t" fillcolor="#a0a0a0" stroked="f"/>
+          <v:rect id="_x0000_i1029" style="width:0;height:1.5pt" o:hralign="center" o:hrstd="t" o:hr="t" fillcolor="#a0a0a0" stroked="f"/>
         </w:pict>
       </w:r>
     </w:p>
     <w:p>
       <w:pPr>
         <w:spacing w:line="240" w:lineRule="auto"/>
+        <w:jc w:val="both"/>
         <w:rPr>
           <w:b/>
           <w:bCs/>
@@ -956,6 +1017,7 @@
     <w:p>
       <w:pPr>
         <w:spacing w:line="240" w:lineRule="auto"/>
+        <w:jc w:val="both"/>
       </w:pPr>
       <w:r>
         <w:rPr>
@@ -981,6 +1043,7 @@
     <w:p>
       <w:pPr>
         <w:spacing w:line="240" w:lineRule="auto"/>
+        <w:jc w:val="both"/>
       </w:pPr>
       <w:r>
         <w:t>It contains information such as:</w:t>
@@ -993,6 +1056,7 @@
           <w:numId w:val="7"/>
         </w:numPr>
         <w:spacing w:line="240" w:lineRule="auto"/>
+        <w:jc w:val="both"/>
       </w:pPr>
       <w:r>
         <w:t xml:space="preserve">Project name </w:t>
@@ -1005,6 +1069,7 @@
           <w:numId w:val="7"/>
         </w:numPr>
         <w:spacing w:line="240" w:lineRule="auto"/>
+        <w:jc w:val="both"/>
       </w:pPr>
       <w:r>
         <w:t xml:space="preserve">Version </w:t>
@@ -1017,6 +1082,7 @@
           <w:numId w:val="7"/>
         </w:numPr>
         <w:spacing w:line="240" w:lineRule="auto"/>
+        <w:jc w:val="both"/>
       </w:pPr>
       <w:r>
         <w:t xml:space="preserve">Dependencies </w:t>
@@ -1029,6 +1095,7 @@
           <w:numId w:val="7"/>
         </w:numPr>
         <w:spacing w:line="240" w:lineRule="auto"/>
+        <w:jc w:val="both"/>
       </w:pPr>
       <w:r>
         <w:t xml:space="preserve">Scripts </w:t>
@@ -1041,6 +1108,7 @@
           <w:numId w:val="7"/>
         </w:numPr>
         <w:spacing w:line="240" w:lineRule="auto"/>
+        <w:jc w:val="both"/>
       </w:pPr>
       <w:r>
         <w:t xml:space="preserve">Project description </w:t>
@@ -1049,6 +1117,7 @@
     <w:p>
       <w:pPr>
         <w:spacing w:line="240" w:lineRule="auto"/>
+        <w:jc w:val="both"/>
       </w:pPr>
       <w:r>
         <w:rPr>
@@ -1061,6 +1130,7 @@
     <w:p>
       <w:pPr>
         <w:spacing w:line="240" w:lineRule="auto"/>
+        <w:jc w:val="both"/>
       </w:pPr>
       <w:r>
         <w:t>{</w:t>
@@ -1069,6 +1139,7 @@
     <w:p>
       <w:pPr>
         <w:spacing w:line="240" w:lineRule="auto"/>
+        <w:jc w:val="both"/>
       </w:pPr>
       <w:r>
         <w:t xml:space="preserve">  "name": "my-app",</w:t>
@@ -1077,6 +1148,7 @@
     <w:p>
       <w:pPr>
         <w:spacing w:line="240" w:lineRule="auto"/>
+        <w:jc w:val="both"/>
       </w:pPr>
       <w:r>
         <w:t xml:space="preserve">  "version": "1.0.0",</w:t>
@@ -1085,6 +1157,7 @@
     <w:p>
       <w:pPr>
         <w:spacing w:line="240" w:lineRule="auto"/>
+        <w:jc w:val="both"/>
       </w:pPr>
       <w:r>
         <w:t xml:space="preserve">  "scripts": {</w:t>
@@ -1093,6 +1166,7 @@
     <w:p>
       <w:pPr>
         <w:spacing w:line="240" w:lineRule="auto"/>
+        <w:jc w:val="both"/>
       </w:pPr>
       <w:r>
         <w:t xml:space="preserve">    "start": "node server.js"</w:t>
@@ -1101,6 +1175,7 @@
     <w:p>
       <w:pPr>
         <w:spacing w:line="240" w:lineRule="auto"/>
+        <w:jc w:val="both"/>
       </w:pPr>
       <w:r>
         <w:t xml:space="preserve">  },</w:t>
@@ -1109,6 +1184,7 @@
     <w:p>
       <w:pPr>
         <w:spacing w:line="240" w:lineRule="auto"/>
+        <w:jc w:val="both"/>
       </w:pPr>
       <w:r>
         <w:t xml:space="preserve">  "dependencies": {</w:t>
@@ -1117,6 +1193,7 @@
     <w:p>
       <w:pPr>
         <w:spacing w:line="240" w:lineRule="auto"/>
+        <w:jc w:val="both"/>
       </w:pPr>
       <w:r>
         <w:t xml:space="preserve">    "express": "^5.1.0"</w:t>
@@ -1125,6 +1202,7 @@
     <w:p>
       <w:pPr>
         <w:spacing w:line="240" w:lineRule="auto"/>
+        <w:jc w:val="both"/>
       </w:pPr>
       <w:r>
         <w:t xml:space="preserve">  }</w:t>
@@ -1133,6 +1211,7 @@
     <w:p>
       <w:pPr>
         <w:spacing w:line="240" w:lineRule="auto"/>
+        <w:jc w:val="both"/>
       </w:pPr>
       <w:r>
         <w:t>}</w:t>
@@ -1141,16 +1220,18 @@
     <w:p>
       <w:pPr>
         <w:spacing w:line="240" w:lineRule="auto"/>
+        <w:jc w:val="both"/>
       </w:pPr>
       <w:r>
         <w:pict w14:anchorId="47FF7B94">
-          <v:rect id="_x0000_i1090" style="width:0;height:1.5pt" o:hralign="center" o:hrstd="t" o:hr="t" fillcolor="#a0a0a0" stroked="f"/>
+          <v:rect id="_x0000_i1030" style="width:0;height:1.5pt" o:hralign="center" o:hrstd="t" o:hr="t" fillcolor="#a0a0a0" stroked="f"/>
         </w:pict>
       </w:r>
     </w:p>
     <w:p>
       <w:pPr>
         <w:spacing w:line="240" w:lineRule="auto"/>
+        <w:jc w:val="both"/>
         <w:rPr>
           <w:b/>
           <w:bCs/>
@@ -1167,6 +1248,7 @@
     <w:p>
       <w:pPr>
         <w:spacing w:line="240" w:lineRule="auto"/>
+        <w:jc w:val="both"/>
       </w:pPr>
       <w:r>
         <w:rPr>
@@ -1179,6 +1261,7 @@
     <w:p>
       <w:pPr>
         <w:spacing w:line="240" w:lineRule="auto"/>
+        <w:jc w:val="both"/>
       </w:pPr>
       <w:r>
         <w:rPr>
@@ -1195,6 +1278,7 @@
     <w:p>
       <w:pPr>
         <w:spacing w:line="240" w:lineRule="auto"/>
+        <w:jc w:val="both"/>
       </w:pPr>
       <w:r>
         <w:rPr>
@@ -1211,6 +1295,7 @@
     <w:p>
       <w:pPr>
         <w:spacing w:line="240" w:lineRule="auto"/>
+        <w:jc w:val="both"/>
       </w:pPr>
       <w:r>
         <w:rPr>
@@ -1223,6 +1308,7 @@
     <w:p>
       <w:pPr>
         <w:spacing w:line="240" w:lineRule="auto"/>
+        <w:jc w:val="both"/>
       </w:pPr>
       <w:proofErr w:type="spellStart"/>
       <w:r>
@@ -1236,11 +1322,13 @@
     <w:p>
       <w:pPr>
         <w:spacing w:line="240" w:lineRule="auto"/>
-      </w:pPr>
-    </w:p>
-    <w:p>
-      <w:pPr>
-        <w:spacing w:line="240" w:lineRule="auto"/>
+        <w:jc w:val="both"/>
+      </w:pPr>
+    </w:p>
+    <w:p>
+      <w:pPr>
+        <w:spacing w:line="240" w:lineRule="auto"/>
+        <w:jc w:val="both"/>
       </w:pPr>
       <w:proofErr w:type="spellStart"/>
       <w:proofErr w:type="gramStart"/>
@@ -1256,6 +1344,7 @@
     <w:p>
       <w:pPr>
         <w:spacing w:line="240" w:lineRule="auto"/>
+        <w:jc w:val="both"/>
       </w:pPr>
       <w:r>
         <w:lastRenderedPageBreak/>
@@ -1265,6 +1354,7 @@
     <w:p>
       <w:pPr>
         <w:spacing w:line="240" w:lineRule="auto"/>
+        <w:jc w:val="both"/>
       </w:pPr>
       <w:r>
         <w:t>});</w:t>
@@ -1273,11 +1363,13 @@
     <w:p>
       <w:pPr>
         <w:spacing w:line="240" w:lineRule="auto"/>
-      </w:pPr>
-    </w:p>
-    <w:p>
-      <w:pPr>
-        <w:spacing w:line="240" w:lineRule="auto"/>
+        <w:jc w:val="both"/>
+      </w:pPr>
+    </w:p>
+    <w:p>
+      <w:pPr>
+        <w:spacing w:line="240" w:lineRule="auto"/>
+        <w:jc w:val="both"/>
       </w:pPr>
       <w:proofErr w:type="gramStart"/>
       <w:r>
@@ -1291,6 +1383,7 @@
     <w:p>
       <w:pPr>
         <w:spacing w:line="240" w:lineRule="auto"/>
+        <w:jc w:val="both"/>
       </w:pPr>
       <w:r>
         <w:t>Here, Node.js doesn't have to wait for the file-reading operation before executing the next statement.</w:t>
@@ -1299,16 +1392,18 @@
     <w:p>
       <w:pPr>
         <w:spacing w:line="240" w:lineRule="auto"/>
+        <w:jc w:val="both"/>
       </w:pPr>
       <w:r>
         <w:pict w14:anchorId="2F34C8BD">
-          <v:rect id="_x0000_i1091" style="width:0;height:1.5pt" o:hralign="center" o:hrstd="t" o:hr="t" fillcolor="#a0a0a0" stroked="f"/>
+          <v:rect id="_x0000_i1031" style="width:0;height:1.5pt" o:hralign="center" o:hrstd="t" o:hr="t" fillcolor="#a0a0a0" stroked="f"/>
         </w:pict>
       </w:r>
     </w:p>
     <w:p>
       <w:pPr>
         <w:spacing w:line="240" w:lineRule="auto"/>
+        <w:jc w:val="both"/>
         <w:rPr>
           <w:b/>
           <w:bCs/>
@@ -1325,6 +1420,7 @@
     <w:p>
       <w:pPr>
         <w:spacing w:line="240" w:lineRule="auto"/>
+        <w:jc w:val="both"/>
       </w:pPr>
       <w:r>
         <w:rPr>
@@ -1341,6 +1437,7 @@
     <w:p>
       <w:pPr>
         <w:spacing w:line="240" w:lineRule="auto"/>
+        <w:jc w:val="both"/>
       </w:pPr>
       <w:r>
         <w:t>Node.js supports built-in modules such as:</w:t>
@@ -1353,6 +1450,7 @@
           <w:numId w:val="8"/>
         </w:numPr>
         <w:spacing w:line="240" w:lineRule="auto"/>
+        <w:jc w:val="both"/>
       </w:pPr>
       <w:r>
         <w:t xml:space="preserve">fs </w:t>
@@ -1365,6 +1463,7 @@
           <w:numId w:val="8"/>
         </w:numPr>
         <w:spacing w:line="240" w:lineRule="auto"/>
+        <w:jc w:val="both"/>
       </w:pPr>
       <w:r>
         <w:t xml:space="preserve">http </w:t>
@@ -1377,6 +1476,7 @@
           <w:numId w:val="8"/>
         </w:numPr>
         <w:spacing w:line="240" w:lineRule="auto"/>
+        <w:jc w:val="both"/>
       </w:pPr>
       <w:r>
         <w:t xml:space="preserve">path </w:t>
@@ -1389,6 +1489,7 @@
           <w:numId w:val="8"/>
         </w:numPr>
         <w:spacing w:line="240" w:lineRule="auto"/>
+        <w:jc w:val="both"/>
       </w:pPr>
       <w:proofErr w:type="spellStart"/>
       <w:r>
@@ -1406,6 +1507,7 @@
           <w:numId w:val="8"/>
         </w:numPr>
         <w:spacing w:line="240" w:lineRule="auto"/>
+        <w:jc w:val="both"/>
       </w:pPr>
       <w:r>
         <w:t xml:space="preserve">events </w:t>
@@ -1414,6 +1516,7 @@
     <w:p>
       <w:pPr>
         <w:spacing w:line="240" w:lineRule="auto"/>
+        <w:jc w:val="both"/>
       </w:pPr>
       <w:r>
         <w:rPr>
@@ -1426,6 +1529,7 @@
     <w:p>
       <w:pPr>
         <w:spacing w:line="240" w:lineRule="auto"/>
+        <w:jc w:val="both"/>
       </w:pPr>
       <w:proofErr w:type="spellStart"/>
       <w:r>
@@ -1439,11 +1543,13 @@
     <w:p>
       <w:pPr>
         <w:spacing w:line="240" w:lineRule="auto"/>
-      </w:pPr>
-    </w:p>
-    <w:p>
-      <w:pPr>
-        <w:spacing w:line="240" w:lineRule="auto"/>
+        <w:jc w:val="both"/>
+      </w:pPr>
+    </w:p>
+    <w:p>
+      <w:pPr>
+        <w:spacing w:line="240" w:lineRule="auto"/>
+        <w:jc w:val="both"/>
       </w:pPr>
       <w:proofErr w:type="spellStart"/>
       <w:proofErr w:type="gramStart"/>
@@ -1459,6 +1565,7 @@
     <w:p>
       <w:pPr>
         <w:spacing w:line="240" w:lineRule="auto"/>
+        <w:jc w:val="both"/>
       </w:pPr>
       <w:r>
         <w:t>We can also create our own modules.</w:t>
@@ -1467,6 +1574,7 @@
     <w:p>
       <w:pPr>
         <w:spacing w:line="240" w:lineRule="auto"/>
+        <w:jc w:val="both"/>
       </w:pPr>
       <w:r>
         <w:rPr>
@@ -1479,6 +1587,7 @@
     <w:p>
       <w:pPr>
         <w:spacing w:line="240" w:lineRule="auto"/>
+        <w:jc w:val="both"/>
       </w:pPr>
       <w:proofErr w:type="spellStart"/>
       <w:r>
@@ -1492,11 +1601,13 @@
     <w:p>
       <w:pPr>
         <w:spacing w:line="240" w:lineRule="auto"/>
-      </w:pPr>
-    </w:p>
-    <w:p>
-      <w:pPr>
-        <w:spacing w:line="240" w:lineRule="auto"/>
+        <w:jc w:val="both"/>
+      </w:pPr>
+    </w:p>
+    <w:p>
+      <w:pPr>
+        <w:spacing w:line="240" w:lineRule="auto"/>
+        <w:jc w:val="both"/>
       </w:pPr>
       <w:proofErr w:type="spellStart"/>
       <w:proofErr w:type="gramStart"/>
@@ -1512,6 +1623,7 @@
     <w:p>
       <w:pPr>
         <w:spacing w:line="240" w:lineRule="auto"/>
+        <w:jc w:val="both"/>
       </w:pPr>
       <w:r>
         <w:rPr>
@@ -1524,6 +1636,7 @@
     <w:p>
       <w:pPr>
         <w:spacing w:line="240" w:lineRule="auto"/>
+        <w:jc w:val="both"/>
       </w:pPr>
       <w:proofErr w:type="spellStart"/>
       <w:r>
@@ -1545,11 +1658,13 @@
     <w:p>
       <w:pPr>
         <w:spacing w:line="240" w:lineRule="auto"/>
-      </w:pPr>
-    </w:p>
-    <w:p>
-      <w:pPr>
-        <w:spacing w:line="240" w:lineRule="auto"/>
+        <w:jc w:val="both"/>
+      </w:pPr>
+    </w:p>
+    <w:p>
+      <w:pPr>
+        <w:spacing w:line="240" w:lineRule="auto"/>
+        <w:jc w:val="both"/>
       </w:pPr>
       <w:proofErr w:type="gramStart"/>
       <w:r>
@@ -1563,16 +1678,18 @@
     <w:p>
       <w:pPr>
         <w:spacing w:line="240" w:lineRule="auto"/>
+        <w:jc w:val="both"/>
       </w:pPr>
       <w:r>
         <w:pict w14:anchorId="1705CAB0">
-          <v:rect id="_x0000_i1092" style="width:0;height:1.5pt" o:hralign="center" o:hrstd="t" o:hr="t" fillcolor="#a0a0a0" stroked="f"/>
+          <v:rect id="_x0000_i1032" style="width:0;height:1.5pt" o:hralign="center" o:hrstd="t" o:hr="t" fillcolor="#a0a0a0" stroked="f"/>
         </w:pict>
       </w:r>
     </w:p>
     <w:p>
       <w:pPr>
         <w:spacing w:line="240" w:lineRule="auto"/>
+        <w:jc w:val="both"/>
         <w:rPr>
           <w:b/>
           <w:bCs/>
@@ -1589,6 +1706,7 @@
     <w:p>
       <w:pPr>
         <w:spacing w:line="240" w:lineRule="auto"/>
+        <w:jc w:val="both"/>
       </w:pPr>
       <w:r>
         <w:rPr>
@@ -1616,6 +1734,7 @@
     <w:p>
       <w:pPr>
         <w:spacing w:line="240" w:lineRule="auto"/>
+        <w:jc w:val="both"/>
       </w:pPr>
       <w:r>
         <w:t>It has access to:</w:t>
@@ -1624,6 +1743,7 @@
     <w:p>
       <w:pPr>
         <w:spacing w:line="240" w:lineRule="auto"/>
+        <w:jc w:val="both"/>
       </w:pPr>
       <w:r>
         <w:t>(</w:t>
@@ -1640,6 +1760,7 @@
     <w:p>
       <w:pPr>
         <w:spacing w:line="240" w:lineRule="auto"/>
+        <w:jc w:val="both"/>
       </w:pPr>
       <w:r>
         <w:rPr>
@@ -1652,6 +1773,7 @@
     <w:p>
       <w:pPr>
         <w:spacing w:line="240" w:lineRule="auto"/>
+        <w:jc w:val="both"/>
       </w:pPr>
       <w:proofErr w:type="spellStart"/>
       <w:r>
@@ -1665,6 +1787,7 @@
     <w:p>
       <w:pPr>
         <w:spacing w:line="240" w:lineRule="auto"/>
+        <w:jc w:val="both"/>
       </w:pPr>
       <w:proofErr w:type="spellStart"/>
       <w:r>
@@ -1686,11 +1809,13 @@
     <w:p>
       <w:pPr>
         <w:spacing w:line="240" w:lineRule="auto"/>
-      </w:pPr>
-    </w:p>
-    <w:p>
-      <w:pPr>
-        <w:spacing w:line="240" w:lineRule="auto"/>
+        <w:jc w:val="both"/>
+      </w:pPr>
+    </w:p>
+    <w:p>
+      <w:pPr>
+        <w:spacing w:line="240" w:lineRule="auto"/>
+        <w:jc w:val="both"/>
       </w:pPr>
       <w:proofErr w:type="spellStart"/>
       <w:proofErr w:type="gramStart"/>
@@ -1717,6 +1842,7 @@
     <w:p>
       <w:pPr>
         <w:spacing w:line="240" w:lineRule="auto"/>
+        <w:jc w:val="both"/>
       </w:pPr>
       <w:r>
         <w:t xml:space="preserve">    </w:t>
@@ -1733,6 +1859,7 @@
     <w:p>
       <w:pPr>
         <w:spacing w:line="240" w:lineRule="auto"/>
+        <w:jc w:val="both"/>
       </w:pPr>
       <w:r>
         <w:t xml:space="preserve">    </w:t>
@@ -1749,6 +1876,7 @@
     <w:p>
       <w:pPr>
         <w:spacing w:line="240" w:lineRule="auto"/>
+        <w:jc w:val="both"/>
       </w:pPr>
       <w:r>
         <w:t>});</w:t>
@@ -1757,11 +1885,13 @@
     <w:p>
       <w:pPr>
         <w:spacing w:line="240" w:lineRule="auto"/>
-      </w:pPr>
-    </w:p>
-    <w:p>
-      <w:pPr>
-        <w:spacing w:line="240" w:lineRule="auto"/>
+        <w:jc w:val="both"/>
+      </w:pPr>
+    </w:p>
+    <w:p>
+      <w:pPr>
+        <w:spacing w:line="240" w:lineRule="auto"/>
+        <w:jc w:val="both"/>
       </w:pPr>
       <w:proofErr w:type="spellStart"/>
       <w:proofErr w:type="gramStart"/>
@@ -1788,6 +1918,7 @@
     <w:p>
       <w:pPr>
         <w:spacing w:line="240" w:lineRule="auto"/>
+        <w:jc w:val="both"/>
       </w:pPr>
       <w:r>
         <w:t xml:space="preserve">    </w:t>
@@ -1806,6 +1937,7 @@
     <w:p>
       <w:pPr>
         <w:spacing w:line="240" w:lineRule="auto"/>
+        <w:jc w:val="both"/>
       </w:pPr>
       <w:r>
         <w:t>});</w:t>
@@ -1814,11 +1946,13 @@
     <w:p>
       <w:pPr>
         <w:spacing w:line="240" w:lineRule="auto"/>
-      </w:pPr>
-    </w:p>
-    <w:p>
-      <w:pPr>
-        <w:spacing w:line="240" w:lineRule="auto"/>
+        <w:jc w:val="both"/>
+      </w:pPr>
+    </w:p>
+    <w:p>
+      <w:pPr>
+        <w:spacing w:line="240" w:lineRule="auto"/>
+        <w:jc w:val="both"/>
       </w:pPr>
       <w:proofErr w:type="spellStart"/>
       <w:proofErr w:type="gramStart"/>
@@ -1834,6 +1968,7 @@
     <w:p>
       <w:pPr>
         <w:spacing w:line="240" w:lineRule="auto"/>
+        <w:jc w:val="both"/>
       </w:pPr>
       <w:proofErr w:type="gramStart"/>
       <w:r>
@@ -1847,16 +1982,18 @@
     <w:p>
       <w:pPr>
         <w:spacing w:line="240" w:lineRule="auto"/>
+        <w:jc w:val="both"/>
       </w:pPr>
       <w:r>
         <w:pict w14:anchorId="543D751D">
-          <v:rect id="_x0000_i1093" style="width:0;height:1.5pt" o:hralign="center" o:hrstd="t" o:hr="t" fillcolor="#a0a0a0" stroked="f"/>
+          <v:rect id="_x0000_i1033" style="width:0;height:1.5pt" o:hralign="center" o:hrstd="t" o:hr="t" fillcolor="#a0a0a0" stroked="f"/>
         </w:pict>
       </w:r>
     </w:p>
     <w:p>
       <w:pPr>
         <w:spacing w:line="240" w:lineRule="auto"/>
+        <w:jc w:val="both"/>
         <w:rPr>
           <w:b/>
           <w:bCs/>
@@ -1889,6 +2026,7 @@
     <w:p>
       <w:pPr>
         <w:spacing w:line="240" w:lineRule="auto"/>
+        <w:jc w:val="both"/>
       </w:pPr>
       <w:r>
         <w:rPr>
@@ -1905,6 +2043,7 @@
     <w:p>
       <w:pPr>
         <w:spacing w:line="240" w:lineRule="auto"/>
+        <w:jc w:val="both"/>
       </w:pPr>
       <w:proofErr w:type="spellStart"/>
       <w:r>
@@ -1926,6 +2065,7 @@
     <w:p>
       <w:pPr>
         <w:spacing w:line="240" w:lineRule="auto"/>
+        <w:jc w:val="both"/>
       </w:pPr>
       <w:proofErr w:type="spellStart"/>
       <w:r>
@@ -1939,6 +2079,7 @@
     <w:p>
       <w:pPr>
         <w:spacing w:line="240" w:lineRule="auto"/>
+        <w:jc w:val="both"/>
       </w:pPr>
       <w:r>
         <w:rPr>
@@ -1951,6 +2092,7 @@
     <w:p>
       <w:pPr>
         <w:spacing w:line="240" w:lineRule="auto"/>
+        <w:jc w:val="both"/>
       </w:pPr>
       <w:r>
         <w:t>import express from "express";</w:t>
@@ -1959,6 +2101,7 @@
     <w:p>
       <w:pPr>
         <w:spacing w:line="240" w:lineRule="auto"/>
+        <w:jc w:val="both"/>
       </w:pPr>
       <w:proofErr w:type="spellStart"/>
       <w:r>
@@ -1972,6 +2115,7 @@
     <w:p>
       <w:pPr>
         <w:spacing w:line="240" w:lineRule="auto"/>
+        <w:jc w:val="both"/>
       </w:pPr>
       <w:proofErr w:type="spellStart"/>
       <w:proofErr w:type="gramStart"/>
@@ -1987,6 +2131,7 @@
     <w:p>
       <w:pPr>
         <w:spacing w:line="240" w:lineRule="auto"/>
+        <w:jc w:val="both"/>
       </w:pPr>
       <w:r>
         <w:t>ES Modules commonly use:</w:t>
@@ -1995,6 +2140,7 @@
     <w:p>
       <w:pPr>
         <w:spacing w:line="240" w:lineRule="auto"/>
+        <w:jc w:val="both"/>
       </w:pPr>
       <w:r>
         <w:t>export default ...</w:t>
@@ -2003,6 +2149,7 @@
     <w:p>
       <w:pPr>
         <w:spacing w:line="240" w:lineRule="auto"/>
+        <w:jc w:val="both"/>
       </w:pPr>
       <w:r>
         <w:rPr>
@@ -2016,6 +2163,7 @@
     <w:p>
       <w:pPr>
         <w:spacing w:line="240" w:lineRule="auto"/>
+        <w:jc w:val="both"/>
       </w:pPr>
       <w:proofErr w:type="gramStart"/>
       <w:r>
@@ -2037,16 +2185,2434 @@
     <w:p>
       <w:pPr>
         <w:spacing w:line="240" w:lineRule="auto"/>
+        <w:jc w:val="both"/>
       </w:pPr>
       <w:r>
         <w:pict w14:anchorId="54C2B5B2">
-          <v:rect id="_x0000_i1094" style="width:0;height:1.5pt" o:hralign="center" o:hrstd="t" o:hr="t" fillcolor="#a0a0a0" stroked="f"/>
+          <v:rect id="_x0000_i1034" style="width:0;height:1.5pt" o:hralign="center" o:hrstd="t" o:hr="t" fillcolor="#a0a0a0" stroked="f"/>
         </w:pict>
       </w:r>
     </w:p>
     <w:p>
       <w:pPr>
         <w:spacing w:line="240" w:lineRule="auto"/>
+        <w:jc w:val="both"/>
+        <w:rPr>
+          <w:b/>
+          <w:bCs/>
+        </w:rPr>
+      </w:pPr>
+      <w:r>
+        <w:rPr>
+          <w:b/>
+          <w:bCs/>
+        </w:rPr>
+        <w:t xml:space="preserve">11. What is the difference between </w:t>
+      </w:r>
+      <w:proofErr w:type="spellStart"/>
+      <w:proofErr w:type="gramStart"/>
+      <w:r>
+        <w:rPr>
+          <w:b/>
+          <w:bCs/>
+        </w:rPr>
+        <w:t>process.nextTick</w:t>
+      </w:r>
+      <w:proofErr w:type="spellEnd"/>
+      <w:proofErr w:type="gramEnd"/>
+      <w:r>
+        <w:rPr>
+          <w:b/>
+          <w:bCs/>
+        </w:rPr>
+        <w:t xml:space="preserve">() and </w:t>
+      </w:r>
+      <w:proofErr w:type="spellStart"/>
+      <w:proofErr w:type="gramStart"/>
+      <w:r>
+        <w:rPr>
+          <w:b/>
+          <w:bCs/>
+        </w:rPr>
+        <w:t>setImmediate</w:t>
+      </w:r>
+      <w:proofErr w:type="spellEnd"/>
+      <w:r>
+        <w:rPr>
+          <w:b/>
+          <w:bCs/>
+        </w:rPr>
+        <w:t>(</w:t>
+      </w:r>
+      <w:proofErr w:type="gramEnd"/>
+      <w:r>
+        <w:rPr>
+          <w:b/>
+          <w:bCs/>
+        </w:rPr>
+        <w:t>)?</w:t>
+      </w:r>
+    </w:p>
+    <w:p>
+      <w:pPr>
+        <w:spacing w:line="240" w:lineRule="auto"/>
+        <w:jc w:val="both"/>
+      </w:pPr>
+      <w:r>
+        <w:rPr>
+          <w:b/>
+          <w:bCs/>
+        </w:rPr>
+        <w:t>Answer:</w:t>
+      </w:r>
+      <w:r>
+        <w:br/>
+        <w:t>Both are used to execute callbacks asynchronously, but they are handled at different stages of the Node.js event loop.</w:t>
+      </w:r>
+    </w:p>
+    <w:p>
+      <w:pPr>
+        <w:numPr>
+          <w:ilvl w:val="0"/>
+          <w:numId w:val="10"/>
+        </w:numPr>
+        <w:spacing w:line="240" w:lineRule="auto"/>
+        <w:jc w:val="both"/>
+      </w:pPr>
+      <w:proofErr w:type="spellStart"/>
+      <w:proofErr w:type="gramStart"/>
+      <w:r>
+        <w:t>process.nextTick</w:t>
+      </w:r>
+      <w:proofErr w:type="spellEnd"/>
+      <w:proofErr w:type="gramEnd"/>
+      <w:r>
+        <w:t xml:space="preserve">() executes its callback </w:t>
+      </w:r>
+      <w:r>
+        <w:rPr>
+          <w:b/>
+          <w:bCs/>
+        </w:rPr>
+        <w:t>before the event loop continues</w:t>
+      </w:r>
+      <w:r>
+        <w:t xml:space="preserve">. </w:t>
+      </w:r>
+    </w:p>
+    <w:p>
+      <w:pPr>
+        <w:numPr>
+          <w:ilvl w:val="0"/>
+          <w:numId w:val="10"/>
+        </w:numPr>
+        <w:spacing w:line="240" w:lineRule="auto"/>
+        <w:jc w:val="both"/>
+      </w:pPr>
+      <w:proofErr w:type="spellStart"/>
+      <w:proofErr w:type="gramStart"/>
+      <w:r>
+        <w:t>setImmediate</w:t>
+      </w:r>
+      <w:proofErr w:type="spellEnd"/>
+      <w:r>
+        <w:t>(</w:t>
+      </w:r>
+      <w:proofErr w:type="gramEnd"/>
+      <w:r>
+        <w:t xml:space="preserve">) executes the callback in the </w:t>
+      </w:r>
+      <w:r>
+        <w:rPr>
+          <w:b/>
+          <w:bCs/>
+        </w:rPr>
+        <w:t>check phase</w:t>
+      </w:r>
+      <w:r>
+        <w:t xml:space="preserve"> of the event loop. </w:t>
+      </w:r>
+    </w:p>
+    <w:p>
+      <w:pPr>
+        <w:spacing w:line="240" w:lineRule="auto"/>
+        <w:jc w:val="both"/>
+      </w:pPr>
+      <w:r>
+        <w:rPr>
+          <w:b/>
+          <w:bCs/>
+        </w:rPr>
+        <w:t>Example:</w:t>
+      </w:r>
+    </w:p>
+    <w:p>
+      <w:pPr>
+        <w:spacing w:line="240" w:lineRule="auto"/>
+        <w:jc w:val="both"/>
+      </w:pPr>
+      <w:r>
+        <w:t>console.log("Start");</w:t>
+      </w:r>
+    </w:p>
+    <w:p>
+      <w:pPr>
+        <w:spacing w:line="240" w:lineRule="auto"/>
+        <w:jc w:val="both"/>
+      </w:pPr>
+    </w:p>
+    <w:p>
+      <w:pPr>
+        <w:spacing w:line="240" w:lineRule="auto"/>
+        <w:jc w:val="both"/>
+      </w:pPr>
+      <w:proofErr w:type="spellStart"/>
+      <w:proofErr w:type="gramStart"/>
+      <w:r>
+        <w:t>process.nextTick</w:t>
+      </w:r>
+      <w:proofErr w:type="spellEnd"/>
+      <w:proofErr w:type="gramEnd"/>
+      <w:r>
+        <w:t>(() =&gt; {</w:t>
+      </w:r>
+    </w:p>
+    <w:p>
+      <w:pPr>
+        <w:spacing w:line="240" w:lineRule="auto"/>
+        <w:jc w:val="both"/>
+      </w:pPr>
+      <w:r>
+        <w:t xml:space="preserve">    console.log("</w:t>
+      </w:r>
+      <w:proofErr w:type="spellStart"/>
+      <w:r>
+        <w:t>nextTick</w:t>
+      </w:r>
+      <w:proofErr w:type="spellEnd"/>
+      <w:r>
+        <w:t>");</w:t>
+      </w:r>
+    </w:p>
+    <w:p>
+      <w:pPr>
+        <w:spacing w:line="240" w:lineRule="auto"/>
+        <w:jc w:val="both"/>
+      </w:pPr>
+      <w:r>
+        <w:t>});</w:t>
+      </w:r>
+    </w:p>
+    <w:p>
+      <w:pPr>
+        <w:spacing w:line="240" w:lineRule="auto"/>
+        <w:jc w:val="both"/>
+      </w:pPr>
+    </w:p>
+    <w:p>
+      <w:pPr>
+        <w:spacing w:line="240" w:lineRule="auto"/>
+        <w:jc w:val="both"/>
+      </w:pPr>
+      <w:proofErr w:type="spellStart"/>
+      <w:proofErr w:type="gramStart"/>
+      <w:r>
+        <w:t>setImmediate</w:t>
+      </w:r>
+      <w:proofErr w:type="spellEnd"/>
+      <w:r>
+        <w:t>(</w:t>
+      </w:r>
+      <w:proofErr w:type="gramEnd"/>
+      <w:r>
+        <w:t>() =&gt; {</w:t>
+      </w:r>
+    </w:p>
+    <w:p>
+      <w:pPr>
+        <w:spacing w:line="240" w:lineRule="auto"/>
+        <w:jc w:val="both"/>
+      </w:pPr>
+      <w:r>
+        <w:t xml:space="preserve">    console.log("</w:t>
+      </w:r>
+      <w:proofErr w:type="spellStart"/>
+      <w:r>
+        <w:t>setImmediate</w:t>
+      </w:r>
+      <w:proofErr w:type="spellEnd"/>
+      <w:r>
+        <w:t>");</w:t>
+      </w:r>
+    </w:p>
+    <w:p>
+      <w:pPr>
+        <w:spacing w:line="240" w:lineRule="auto"/>
+        <w:jc w:val="both"/>
+      </w:pPr>
+      <w:r>
+        <w:t>});</w:t>
+      </w:r>
+    </w:p>
+    <w:p>
+      <w:pPr>
+        <w:spacing w:line="240" w:lineRule="auto"/>
+        <w:jc w:val="both"/>
+      </w:pPr>
+    </w:p>
+    <w:p>
+      <w:pPr>
+        <w:spacing w:line="240" w:lineRule="auto"/>
+        <w:jc w:val="both"/>
+      </w:pPr>
+      <w:r>
+        <w:t>console.log("End");</w:t>
+      </w:r>
+    </w:p>
+    <w:p>
+      <w:pPr>
+        <w:spacing w:line="240" w:lineRule="auto"/>
+        <w:jc w:val="both"/>
+      </w:pPr>
+      <w:r>
+        <w:pict w14:anchorId="4B92D027">
+          <v:rect id="_x0000_i1089" style="width:468pt;height:1.5pt" o:hralign="center" o:hrstd="t" o:hr="t" fillcolor="#a0a0a0" stroked="f"/>
+        </w:pict>
+      </w:r>
+    </w:p>
+    <w:p>
+      <w:pPr>
+        <w:spacing w:line="240" w:lineRule="auto"/>
+        <w:jc w:val="both"/>
+        <w:rPr>
+          <w:b/>
+          <w:bCs/>
+        </w:rPr>
+      </w:pPr>
+      <w:r>
+        <w:rPr>
+          <w:b/>
+          <w:bCs/>
+        </w:rPr>
+        <w:t>12. What is a callback function in Node.js?</w:t>
+      </w:r>
+    </w:p>
+    <w:p>
+      <w:pPr>
+        <w:spacing w:line="240" w:lineRule="auto"/>
+        <w:jc w:val="both"/>
+      </w:pPr>
+      <w:r>
+        <w:rPr>
+          <w:b/>
+          <w:bCs/>
+        </w:rPr>
+        <w:t>Answer:</w:t>
+      </w:r>
+      <w:r>
+        <w:br/>
+        <w:t>A callback is a function that is passed as an argument to another function and is executed after an asynchronous operation is completed.</w:t>
+      </w:r>
+    </w:p>
+    <w:p>
+      <w:pPr>
+        <w:spacing w:line="240" w:lineRule="auto"/>
+        <w:jc w:val="both"/>
+      </w:pPr>
+      <w:r>
+        <w:rPr>
+          <w:b/>
+          <w:bCs/>
+        </w:rPr>
+        <w:t>Example:</w:t>
+      </w:r>
+    </w:p>
+    <w:p>
+      <w:pPr>
+        <w:spacing w:line="240" w:lineRule="auto"/>
+        <w:jc w:val="both"/>
+      </w:pPr>
+      <w:proofErr w:type="spellStart"/>
+      <w:r>
+        <w:t>const</w:t>
+      </w:r>
+      <w:proofErr w:type="spellEnd"/>
+      <w:r>
+        <w:t xml:space="preserve"> fs = require("fs");</w:t>
+      </w:r>
+    </w:p>
+    <w:p>
+      <w:pPr>
+        <w:spacing w:line="240" w:lineRule="auto"/>
+        <w:jc w:val="both"/>
+      </w:pPr>
+    </w:p>
+    <w:p>
+      <w:pPr>
+        <w:spacing w:line="240" w:lineRule="auto"/>
+        <w:jc w:val="both"/>
+      </w:pPr>
+      <w:proofErr w:type="spellStart"/>
+      <w:proofErr w:type="gramStart"/>
+      <w:r>
+        <w:t>fs.readFile</w:t>
+      </w:r>
+      <w:proofErr w:type="spellEnd"/>
+      <w:proofErr w:type="gramEnd"/>
+      <w:r>
+        <w:t>("data.txt", "utf8", (err, data) =&gt; {</w:t>
+      </w:r>
+    </w:p>
+    <w:p>
+      <w:pPr>
+        <w:spacing w:line="240" w:lineRule="auto"/>
+        <w:jc w:val="both"/>
+      </w:pPr>
+      <w:r>
+        <w:t xml:space="preserve">    if (err) {</w:t>
+      </w:r>
+    </w:p>
+    <w:p>
+      <w:pPr>
+        <w:spacing w:line="240" w:lineRule="auto"/>
+        <w:jc w:val="both"/>
+      </w:pPr>
+      <w:r>
+        <w:lastRenderedPageBreak/>
+        <w:t xml:space="preserve">        console.log(err);</w:t>
+      </w:r>
+    </w:p>
+    <w:p>
+      <w:pPr>
+        <w:spacing w:line="240" w:lineRule="auto"/>
+        <w:jc w:val="both"/>
+      </w:pPr>
+      <w:r>
+        <w:t xml:space="preserve">        return;</w:t>
+      </w:r>
+    </w:p>
+    <w:p>
+      <w:pPr>
+        <w:spacing w:line="240" w:lineRule="auto"/>
+        <w:jc w:val="both"/>
+      </w:pPr>
+      <w:r>
+        <w:t xml:space="preserve">    }</w:t>
+      </w:r>
+    </w:p>
+    <w:p>
+      <w:pPr>
+        <w:spacing w:line="240" w:lineRule="auto"/>
+        <w:jc w:val="both"/>
+      </w:pPr>
+    </w:p>
+    <w:p>
+      <w:pPr>
+        <w:spacing w:line="240" w:lineRule="auto"/>
+        <w:jc w:val="both"/>
+      </w:pPr>
+      <w:r>
+        <w:t xml:space="preserve">    console.log(data);</w:t>
+      </w:r>
+    </w:p>
+    <w:p>
+      <w:pPr>
+        <w:spacing w:line="240" w:lineRule="auto"/>
+        <w:jc w:val="both"/>
+      </w:pPr>
+      <w:r>
+        <w:t>});</w:t>
+      </w:r>
+    </w:p>
+    <w:p>
+      <w:pPr>
+        <w:spacing w:line="240" w:lineRule="auto"/>
+        <w:jc w:val="both"/>
+      </w:pPr>
+      <w:r>
+        <w:t>Here, the function (err, data) =&gt; {} is the callback.</w:t>
+      </w:r>
+    </w:p>
+    <w:p>
+      <w:pPr>
+        <w:spacing w:line="240" w:lineRule="auto"/>
+        <w:jc w:val="both"/>
+      </w:pPr>
+      <w:r>
+        <w:pict w14:anchorId="5A4834AB">
+          <v:rect id="_x0000_i1090" style="width:468pt;height:1.5pt" o:hralign="center" o:hrstd="t" o:hr="t" fillcolor="#a0a0a0" stroked="f"/>
+        </w:pict>
+      </w:r>
+    </w:p>
+    <w:p>
+      <w:pPr>
+        <w:spacing w:line="240" w:lineRule="auto"/>
+        <w:jc w:val="both"/>
+        <w:rPr>
+          <w:b/>
+          <w:bCs/>
+        </w:rPr>
+      </w:pPr>
+      <w:r>
+        <w:rPr>
+          <w:b/>
+          <w:bCs/>
+        </w:rPr>
+        <w:t>13. What is Callback Hell?</w:t>
+      </w:r>
+    </w:p>
+    <w:p>
+      <w:pPr>
+        <w:spacing w:line="240" w:lineRule="auto"/>
+        <w:jc w:val="both"/>
+      </w:pPr>
+      <w:r>
+        <w:rPr>
+          <w:b/>
+          <w:bCs/>
+        </w:rPr>
+        <w:t>Answer:</w:t>
+      </w:r>
+      <w:r>
+        <w:br/>
+      </w:r>
+      <w:r>
+        <w:rPr>
+          <w:b/>
+          <w:bCs/>
+        </w:rPr>
+        <w:t>Callback Hell</w:t>
+      </w:r>
+      <w:r>
+        <w:t xml:space="preserve"> occurs when multiple asynchronous operations are nested inside each other, making the code difficult to read and maintain.</w:t>
+      </w:r>
+    </w:p>
+    <w:p>
+      <w:pPr>
+        <w:spacing w:line="240" w:lineRule="auto"/>
+        <w:jc w:val="both"/>
+      </w:pPr>
+      <w:r>
+        <w:rPr>
+          <w:b/>
+          <w:bCs/>
+        </w:rPr>
+        <w:t>Example:</w:t>
+      </w:r>
+    </w:p>
+    <w:p>
+      <w:pPr>
+        <w:spacing w:line="240" w:lineRule="auto"/>
+        <w:jc w:val="both"/>
+      </w:pPr>
+      <w:proofErr w:type="spellStart"/>
+      <w:r>
+        <w:t>getUser</w:t>
+      </w:r>
+      <w:proofErr w:type="spellEnd"/>
+      <w:r>
+        <w:t>((user) =&gt; {</w:t>
+      </w:r>
+    </w:p>
+    <w:p>
+      <w:pPr>
+        <w:spacing w:line="240" w:lineRule="auto"/>
+        <w:jc w:val="both"/>
+      </w:pPr>
+      <w:r>
+        <w:t xml:space="preserve">    </w:t>
+      </w:r>
+      <w:proofErr w:type="spellStart"/>
+      <w:proofErr w:type="gramStart"/>
+      <w:r>
+        <w:t>getOrders</w:t>
+      </w:r>
+      <w:proofErr w:type="spellEnd"/>
+      <w:r>
+        <w:t>(</w:t>
+      </w:r>
+      <w:proofErr w:type="gramEnd"/>
+      <w:r>
+        <w:t>user, (orders) =&gt; {</w:t>
+      </w:r>
+    </w:p>
+    <w:p>
+      <w:pPr>
+        <w:spacing w:line="240" w:lineRule="auto"/>
+        <w:jc w:val="both"/>
+      </w:pPr>
+      <w:r>
+        <w:t xml:space="preserve">        </w:t>
+      </w:r>
+      <w:proofErr w:type="spellStart"/>
+      <w:proofErr w:type="gramStart"/>
+      <w:r>
+        <w:t>getProducts</w:t>
+      </w:r>
+      <w:proofErr w:type="spellEnd"/>
+      <w:r>
+        <w:t>(</w:t>
+      </w:r>
+      <w:proofErr w:type="gramEnd"/>
+      <w:r>
+        <w:t>orders, (products) =&gt; {</w:t>
+      </w:r>
+    </w:p>
+    <w:p>
+      <w:pPr>
+        <w:spacing w:line="240" w:lineRule="auto"/>
+        <w:jc w:val="both"/>
+      </w:pPr>
+      <w:r>
+        <w:t xml:space="preserve">            console.log(products);</w:t>
+      </w:r>
+    </w:p>
+    <w:p>
+      <w:pPr>
+        <w:spacing w:line="240" w:lineRule="auto"/>
+        <w:jc w:val="both"/>
+      </w:pPr>
+      <w:r>
+        <w:t xml:space="preserve">        });</w:t>
+      </w:r>
+    </w:p>
+    <w:p>
+      <w:pPr>
+        <w:spacing w:line="240" w:lineRule="auto"/>
+        <w:jc w:val="both"/>
+      </w:pPr>
+      <w:r>
+        <w:t xml:space="preserve">    });</w:t>
+      </w:r>
+    </w:p>
+    <w:p>
+      <w:pPr>
+        <w:spacing w:line="240" w:lineRule="auto"/>
+        <w:jc w:val="both"/>
+      </w:pPr>
+      <w:r>
+        <w:t>});</w:t>
+      </w:r>
+    </w:p>
+    <w:p>
+      <w:pPr>
+        <w:spacing w:line="240" w:lineRule="auto"/>
+        <w:jc w:val="both"/>
+      </w:pPr>
+      <w:r>
+        <w:t>We can avoid callback hell using:</w:t>
+      </w:r>
+    </w:p>
+    <w:p>
+      <w:pPr>
+        <w:numPr>
+          <w:ilvl w:val="0"/>
+          <w:numId w:val="11"/>
+        </w:numPr>
+        <w:spacing w:line="240" w:lineRule="auto"/>
+        <w:jc w:val="both"/>
+      </w:pPr>
+      <w:r>
+        <w:t xml:space="preserve">Promises </w:t>
+      </w:r>
+    </w:p>
+    <w:p>
+      <w:pPr>
+        <w:numPr>
+          <w:ilvl w:val="0"/>
+          <w:numId w:val="11"/>
+        </w:numPr>
+        <w:spacing w:line="240" w:lineRule="auto"/>
+        <w:jc w:val="both"/>
+      </w:pPr>
+      <w:r>
+        <w:t xml:space="preserve">async/await </w:t>
+      </w:r>
+    </w:p>
+    <w:p>
+      <w:pPr>
+        <w:numPr>
+          <w:ilvl w:val="0"/>
+          <w:numId w:val="11"/>
+        </w:numPr>
+        <w:spacing w:line="240" w:lineRule="auto"/>
+        <w:jc w:val="both"/>
+      </w:pPr>
+      <w:r>
+        <w:t xml:space="preserve">Modular functions </w:t>
+      </w:r>
+    </w:p>
+    <w:p>
+      <w:pPr>
+        <w:spacing w:line="240" w:lineRule="auto"/>
+        <w:jc w:val="both"/>
+      </w:pPr>
+      <w:r>
+        <w:pict w14:anchorId="1F196F6C">
+          <v:rect id="_x0000_i1091" style="width:468pt;height:1.5pt" o:hralign="center" o:hrstd="t" o:hr="t" fillcolor="#a0a0a0" stroked="f"/>
+        </w:pict>
+      </w:r>
+    </w:p>
+    <w:p>
+      <w:pPr>
+        <w:spacing w:line="240" w:lineRule="auto"/>
+        <w:jc w:val="both"/>
+        <w:rPr>
+          <w:b/>
+          <w:bCs/>
+        </w:rPr>
+      </w:pPr>
+      <w:r>
+        <w:rPr>
+          <w:b/>
+          <w:bCs/>
+        </w:rPr>
+        <w:t>14. What are Promises in Node.js?</w:t>
+      </w:r>
+    </w:p>
+    <w:p>
+      <w:pPr>
+        <w:spacing w:line="240" w:lineRule="auto"/>
+        <w:jc w:val="both"/>
+      </w:pPr>
+      <w:r>
+        <w:rPr>
+          <w:b/>
+          <w:bCs/>
+        </w:rPr>
+        <w:t>Answer:</w:t>
+      </w:r>
+      <w:r>
+        <w:br/>
+        <w:t>A Promise represents the eventual completion or failure of an asynchronous operation.</w:t>
+      </w:r>
+    </w:p>
+    <w:p>
+      <w:pPr>
+        <w:spacing w:line="240" w:lineRule="auto"/>
+        <w:jc w:val="both"/>
+      </w:pPr>
+      <w:r>
+        <w:t>A Promise has three states:</w:t>
+      </w:r>
+    </w:p>
+    <w:p>
+      <w:pPr>
+        <w:numPr>
+          <w:ilvl w:val="0"/>
+          <w:numId w:val="12"/>
+        </w:numPr>
+        <w:spacing w:line="240" w:lineRule="auto"/>
+        <w:jc w:val="both"/>
+      </w:pPr>
+      <w:r>
+        <w:rPr>
+          <w:b/>
+          <w:bCs/>
+        </w:rPr>
+        <w:t>Pending</w:t>
+      </w:r>
+      <w:r>
+        <w:t xml:space="preserve"> </w:t>
+      </w:r>
+    </w:p>
+    <w:p>
+      <w:pPr>
+        <w:numPr>
+          <w:ilvl w:val="0"/>
+          <w:numId w:val="12"/>
+        </w:numPr>
+        <w:spacing w:line="240" w:lineRule="auto"/>
+        <w:jc w:val="both"/>
+      </w:pPr>
+      <w:r>
+        <w:rPr>
+          <w:b/>
+          <w:bCs/>
+        </w:rPr>
+        <w:t>Fulfilled</w:t>
+      </w:r>
+      <w:r>
+        <w:t xml:space="preserve"> </w:t>
+      </w:r>
+    </w:p>
+    <w:p>
+      <w:pPr>
+        <w:numPr>
+          <w:ilvl w:val="0"/>
+          <w:numId w:val="12"/>
+        </w:numPr>
+        <w:spacing w:line="240" w:lineRule="auto"/>
+        <w:jc w:val="both"/>
+      </w:pPr>
+      <w:r>
+        <w:rPr>
+          <w:b/>
+          <w:bCs/>
+        </w:rPr>
+        <w:t>Rejected</w:t>
+      </w:r>
+      <w:r>
+        <w:t xml:space="preserve"> </w:t>
+      </w:r>
+    </w:p>
+    <w:p>
+      <w:pPr>
+        <w:spacing w:line="240" w:lineRule="auto"/>
+        <w:jc w:val="both"/>
+      </w:pPr>
+      <w:r>
+        <w:rPr>
+          <w:b/>
+          <w:bCs/>
+        </w:rPr>
+        <w:lastRenderedPageBreak/>
+        <w:t>Example:</w:t>
+      </w:r>
+    </w:p>
+    <w:p>
+      <w:pPr>
+        <w:spacing w:line="240" w:lineRule="auto"/>
+        <w:jc w:val="both"/>
+      </w:pPr>
+      <w:proofErr w:type="spellStart"/>
+      <w:r>
+        <w:t>const</w:t>
+      </w:r>
+      <w:proofErr w:type="spellEnd"/>
+      <w:r>
+        <w:t xml:space="preserve"> </w:t>
+      </w:r>
+      <w:proofErr w:type="spellStart"/>
+      <w:r>
+        <w:t>getData</w:t>
+      </w:r>
+      <w:proofErr w:type="spellEnd"/>
+      <w:r>
+        <w:t xml:space="preserve"> = () =&gt; {</w:t>
+      </w:r>
+    </w:p>
+    <w:p>
+      <w:pPr>
+        <w:spacing w:line="240" w:lineRule="auto"/>
+        <w:jc w:val="both"/>
+      </w:pPr>
+      <w:r>
+        <w:t xml:space="preserve">    return new </w:t>
+      </w:r>
+      <w:proofErr w:type="gramStart"/>
+      <w:r>
+        <w:t>Promise(</w:t>
+      </w:r>
+      <w:proofErr w:type="gramEnd"/>
+      <w:r>
+        <w:t>(resolve, reject) =&gt; {</w:t>
+      </w:r>
+    </w:p>
+    <w:p>
+      <w:pPr>
+        <w:spacing w:line="240" w:lineRule="auto"/>
+        <w:jc w:val="both"/>
+      </w:pPr>
+      <w:r>
+        <w:t xml:space="preserve">        </w:t>
+      </w:r>
+      <w:proofErr w:type="gramStart"/>
+      <w:r>
+        <w:t>resolve(</w:t>
+      </w:r>
+      <w:proofErr w:type="gramEnd"/>
+      <w:r>
+        <w:t>"Data received");</w:t>
+      </w:r>
+    </w:p>
+    <w:p>
+      <w:pPr>
+        <w:spacing w:line="240" w:lineRule="auto"/>
+        <w:jc w:val="both"/>
+      </w:pPr>
+      <w:r>
+        <w:t xml:space="preserve">    });</w:t>
+      </w:r>
+    </w:p>
+    <w:p>
+      <w:pPr>
+        <w:spacing w:line="240" w:lineRule="auto"/>
+        <w:jc w:val="both"/>
+      </w:pPr>
+      <w:r>
+        <w:t>};</w:t>
+      </w:r>
+    </w:p>
+    <w:p>
+      <w:pPr>
+        <w:spacing w:line="240" w:lineRule="auto"/>
+        <w:jc w:val="both"/>
+      </w:pPr>
+    </w:p>
+    <w:p>
+      <w:pPr>
+        <w:spacing w:line="240" w:lineRule="auto"/>
+        <w:jc w:val="both"/>
+      </w:pPr>
+      <w:proofErr w:type="spellStart"/>
+      <w:proofErr w:type="gramStart"/>
+      <w:r>
+        <w:t>getData</w:t>
+      </w:r>
+      <w:proofErr w:type="spellEnd"/>
+      <w:r>
+        <w:t>(</w:t>
+      </w:r>
+      <w:proofErr w:type="gramEnd"/>
+      <w:r>
+        <w:t>)</w:t>
+      </w:r>
+    </w:p>
+    <w:p>
+      <w:pPr>
+        <w:spacing w:line="240" w:lineRule="auto"/>
+        <w:jc w:val="both"/>
+      </w:pPr>
+      <w:r>
+        <w:t xml:space="preserve">    </w:t>
+      </w:r>
+      <w:proofErr w:type="gramStart"/>
+      <w:r>
+        <w:t>.then</w:t>
+      </w:r>
+      <w:proofErr w:type="gramEnd"/>
+      <w:r>
+        <w:t>((data) =&gt; {</w:t>
+      </w:r>
+    </w:p>
+    <w:p>
+      <w:pPr>
+        <w:spacing w:line="240" w:lineRule="auto"/>
+        <w:jc w:val="both"/>
+      </w:pPr>
+      <w:r>
+        <w:t xml:space="preserve">        console.log(data);</w:t>
+      </w:r>
+    </w:p>
+    <w:p>
+      <w:pPr>
+        <w:spacing w:line="240" w:lineRule="auto"/>
+        <w:jc w:val="both"/>
+      </w:pPr>
+      <w:r>
+        <w:t xml:space="preserve">    })</w:t>
+      </w:r>
+    </w:p>
+    <w:p>
+      <w:pPr>
+        <w:spacing w:line="240" w:lineRule="auto"/>
+        <w:jc w:val="both"/>
+      </w:pPr>
+      <w:r>
+        <w:t xml:space="preserve">    </w:t>
+      </w:r>
+      <w:proofErr w:type="gramStart"/>
+      <w:r>
+        <w:t>.catch</w:t>
+      </w:r>
+      <w:proofErr w:type="gramEnd"/>
+      <w:r>
+        <w:t>((error) =&gt; {</w:t>
+      </w:r>
+    </w:p>
+    <w:p>
+      <w:pPr>
+        <w:spacing w:line="240" w:lineRule="auto"/>
+        <w:jc w:val="both"/>
+      </w:pPr>
+      <w:r>
+        <w:t xml:space="preserve">        console.log(error);</w:t>
+      </w:r>
+    </w:p>
+    <w:p>
+      <w:pPr>
+        <w:spacing w:line="240" w:lineRule="auto"/>
+        <w:jc w:val="both"/>
+      </w:pPr>
+      <w:r>
+        <w:t xml:space="preserve">    });</w:t>
+      </w:r>
+    </w:p>
+    <w:p>
+      <w:pPr>
+        <w:spacing w:line="240" w:lineRule="auto"/>
+        <w:jc w:val="both"/>
+      </w:pPr>
+      <w:r>
+        <w:pict w14:anchorId="2DD439E8">
+          <v:rect id="_x0000_i1092" style="width:468pt;height:1.5pt" o:hralign="center" o:hrstd="t" o:hr="t" fillcolor="#a0a0a0" stroked="f"/>
+        </w:pict>
+      </w:r>
+    </w:p>
+    <w:p>
+      <w:pPr>
+        <w:spacing w:line="240" w:lineRule="auto"/>
+        <w:jc w:val="both"/>
+        <w:rPr>
+          <w:b/>
+          <w:bCs/>
+        </w:rPr>
+      </w:pPr>
+      <w:r>
+        <w:rPr>
+          <w:b/>
+          <w:bCs/>
+        </w:rPr>
+        <w:t>15. What is async/await in Node.js?</w:t>
+      </w:r>
+    </w:p>
+    <w:p>
+      <w:pPr>
+        <w:spacing w:line="240" w:lineRule="auto"/>
+        <w:jc w:val="both"/>
+      </w:pPr>
+      <w:r>
+        <w:rPr>
+          <w:b/>
+          <w:bCs/>
+        </w:rPr>
+        <w:t>Answer:</w:t>
+      </w:r>
+      <w:r>
+        <w:br/>
+        <w:t>async/await is a cleaner way to work with Promises.</w:t>
+      </w:r>
+    </w:p>
+    <w:p>
+      <w:pPr>
+        <w:numPr>
+          <w:ilvl w:val="0"/>
+          <w:numId w:val="13"/>
+        </w:numPr>
+        <w:spacing w:line="240" w:lineRule="auto"/>
+        <w:jc w:val="both"/>
+      </w:pPr>
+      <w:r>
+        <w:t xml:space="preserve">async makes a function return a Promise. </w:t>
+      </w:r>
+    </w:p>
+    <w:p>
+      <w:pPr>
+        <w:numPr>
+          <w:ilvl w:val="0"/>
+          <w:numId w:val="13"/>
+        </w:numPr>
+        <w:spacing w:line="240" w:lineRule="auto"/>
+        <w:jc w:val="both"/>
+      </w:pPr>
+      <w:r>
+        <w:t xml:space="preserve">await waits for a Promise to resolve inside an async function. </w:t>
+      </w:r>
+    </w:p>
+    <w:p>
+      <w:pPr>
+        <w:spacing w:line="240" w:lineRule="auto"/>
+        <w:jc w:val="both"/>
+      </w:pPr>
+      <w:r>
+        <w:rPr>
+          <w:b/>
+          <w:bCs/>
+        </w:rPr>
+        <w:t>Example:</w:t>
+      </w:r>
+    </w:p>
+    <w:p>
+      <w:pPr>
+        <w:spacing w:line="240" w:lineRule="auto"/>
+        <w:jc w:val="both"/>
+      </w:pPr>
+      <w:proofErr w:type="spellStart"/>
+      <w:r>
+        <w:t>const</w:t>
+      </w:r>
+      <w:proofErr w:type="spellEnd"/>
+      <w:r>
+        <w:t xml:space="preserve"> </w:t>
+      </w:r>
+      <w:proofErr w:type="spellStart"/>
+      <w:r>
+        <w:t>getData</w:t>
+      </w:r>
+      <w:proofErr w:type="spellEnd"/>
+      <w:r>
+        <w:t xml:space="preserve"> = () =&gt; {</w:t>
+      </w:r>
+    </w:p>
+    <w:p>
+      <w:pPr>
+        <w:spacing w:line="240" w:lineRule="auto"/>
+        <w:jc w:val="both"/>
+      </w:pPr>
+      <w:r>
+        <w:t xml:space="preserve">    return </w:t>
+      </w:r>
+      <w:proofErr w:type="spellStart"/>
+      <w:r>
+        <w:t>Promise.resolve</w:t>
+      </w:r>
+      <w:proofErr w:type="spellEnd"/>
+      <w:r>
+        <w:t>("Data received");</w:t>
+      </w:r>
+    </w:p>
+    <w:p>
+      <w:pPr>
+        <w:spacing w:line="240" w:lineRule="auto"/>
+        <w:jc w:val="both"/>
+      </w:pPr>
+      <w:r>
+        <w:t>};</w:t>
+      </w:r>
+    </w:p>
+    <w:p>
+      <w:pPr>
+        <w:spacing w:line="240" w:lineRule="auto"/>
+        <w:jc w:val="both"/>
+      </w:pPr>
+    </w:p>
+    <w:p>
+      <w:pPr>
+        <w:spacing w:line="240" w:lineRule="auto"/>
+        <w:jc w:val="both"/>
+      </w:pPr>
+      <w:proofErr w:type="spellStart"/>
+      <w:r>
+        <w:t>const</w:t>
+      </w:r>
+      <w:proofErr w:type="spellEnd"/>
+      <w:r>
+        <w:t xml:space="preserve"> </w:t>
+      </w:r>
+      <w:proofErr w:type="spellStart"/>
+      <w:r>
+        <w:t>fetchData</w:t>
+      </w:r>
+      <w:proofErr w:type="spellEnd"/>
+      <w:r>
+        <w:t xml:space="preserve"> = async () =&gt; {</w:t>
+      </w:r>
+    </w:p>
+    <w:p>
+      <w:pPr>
+        <w:spacing w:line="240" w:lineRule="auto"/>
+        <w:jc w:val="both"/>
+      </w:pPr>
+      <w:r>
+        <w:t xml:space="preserve">    try {</w:t>
+      </w:r>
+    </w:p>
+    <w:p>
+      <w:pPr>
+        <w:spacing w:line="240" w:lineRule="auto"/>
+        <w:jc w:val="both"/>
+      </w:pPr>
+      <w:r>
+        <w:t xml:space="preserve">        </w:t>
+      </w:r>
+      <w:proofErr w:type="spellStart"/>
+      <w:r>
+        <w:t>const</w:t>
+      </w:r>
+      <w:proofErr w:type="spellEnd"/>
+      <w:r>
+        <w:t xml:space="preserve"> data = await </w:t>
+      </w:r>
+      <w:proofErr w:type="spellStart"/>
+      <w:proofErr w:type="gramStart"/>
+      <w:r>
+        <w:t>getData</w:t>
+      </w:r>
+      <w:proofErr w:type="spellEnd"/>
+      <w:r>
+        <w:t>(</w:t>
+      </w:r>
+      <w:proofErr w:type="gramEnd"/>
+      <w:r>
+        <w:t>);</w:t>
+      </w:r>
+    </w:p>
+    <w:p>
+      <w:pPr>
+        <w:spacing w:line="240" w:lineRule="auto"/>
+        <w:jc w:val="both"/>
+      </w:pPr>
+      <w:r>
+        <w:t xml:space="preserve">        console.log(data);</w:t>
+      </w:r>
+    </w:p>
+    <w:p>
+      <w:pPr>
+        <w:spacing w:line="240" w:lineRule="auto"/>
+        <w:jc w:val="both"/>
+      </w:pPr>
+      <w:r>
+        <w:t xml:space="preserve">    } catch (error) {</w:t>
+      </w:r>
+    </w:p>
+    <w:p>
+      <w:pPr>
+        <w:spacing w:line="240" w:lineRule="auto"/>
+        <w:jc w:val="both"/>
+      </w:pPr>
+      <w:r>
+        <w:t xml:space="preserve">        console.log(error);</w:t>
+      </w:r>
+    </w:p>
+    <w:p>
+      <w:pPr>
+        <w:spacing w:line="240" w:lineRule="auto"/>
+        <w:jc w:val="both"/>
+      </w:pPr>
+      <w:r>
+        <w:lastRenderedPageBreak/>
+        <w:t xml:space="preserve">    }</w:t>
+      </w:r>
+    </w:p>
+    <w:p>
+      <w:pPr>
+        <w:spacing w:line="240" w:lineRule="auto"/>
+        <w:jc w:val="both"/>
+      </w:pPr>
+      <w:r>
+        <w:t>};</w:t>
+      </w:r>
+    </w:p>
+    <w:p>
+      <w:pPr>
+        <w:spacing w:line="240" w:lineRule="auto"/>
+        <w:jc w:val="both"/>
+      </w:pPr>
+    </w:p>
+    <w:p>
+      <w:pPr>
+        <w:spacing w:line="240" w:lineRule="auto"/>
+        <w:jc w:val="both"/>
+      </w:pPr>
+      <w:proofErr w:type="spellStart"/>
+      <w:proofErr w:type="gramStart"/>
+      <w:r>
+        <w:t>fetchData</w:t>
+      </w:r>
+      <w:proofErr w:type="spellEnd"/>
+      <w:r>
+        <w:t>(</w:t>
+      </w:r>
+      <w:proofErr w:type="gramEnd"/>
+      <w:r>
+        <w:t>);</w:t>
+      </w:r>
+    </w:p>
+    <w:p>
+      <w:pPr>
+        <w:spacing w:line="240" w:lineRule="auto"/>
+        <w:jc w:val="both"/>
+      </w:pPr>
+      <w:r>
+        <w:rPr>
+          <w:b/>
+          <w:bCs/>
+        </w:rPr>
+        <w:t>Interview answer:</w:t>
+      </w:r>
+    </w:p>
+    <w:p>
+      <w:pPr>
+        <w:spacing w:line="240" w:lineRule="auto"/>
+        <w:jc w:val="both"/>
+      </w:pPr>
+      <w:r>
+        <w:t xml:space="preserve">async/await makes asynchronous code easier to read and write compared with nested callbacks and </w:t>
+      </w:r>
+      <w:proofErr w:type="gramStart"/>
+      <w:r>
+        <w:t>multiple .then</w:t>
+      </w:r>
+      <w:proofErr w:type="gramEnd"/>
+      <w:r>
+        <w:t>() calls.</w:t>
+      </w:r>
+    </w:p>
+    <w:p>
+      <w:pPr>
+        <w:spacing w:line="240" w:lineRule="auto"/>
+        <w:jc w:val="both"/>
+      </w:pPr>
+      <w:r>
+        <w:pict w14:anchorId="41BE518C">
+          <v:rect id="_x0000_i1093" style="width:468pt;height:1.5pt" o:hralign="center" o:hrstd="t" o:hr="t" fillcolor="#a0a0a0" stroked="f"/>
+        </w:pict>
+      </w:r>
+    </w:p>
+    <w:p>
+      <w:pPr>
+        <w:spacing w:line="240" w:lineRule="auto"/>
+        <w:jc w:val="both"/>
+        <w:rPr>
+          <w:b/>
+          <w:bCs/>
+        </w:rPr>
+      </w:pPr>
+      <w:r>
+        <w:rPr>
+          <w:b/>
+          <w:bCs/>
+        </w:rPr>
+        <w:t>16. What is the fs module in Node.js?</w:t>
+      </w:r>
+    </w:p>
+    <w:p>
+      <w:pPr>
+        <w:spacing w:line="240" w:lineRule="auto"/>
+        <w:jc w:val="both"/>
+      </w:pPr>
+      <w:r>
+        <w:rPr>
+          <w:b/>
+          <w:bCs/>
+        </w:rPr>
+        <w:t>Answer:</w:t>
+      </w:r>
+      <w:r>
+        <w:br/>
+        <w:t>The fs (</w:t>
+      </w:r>
+      <w:r>
+        <w:rPr>
+          <w:b/>
+          <w:bCs/>
+        </w:rPr>
+        <w:t>File System</w:t>
+      </w:r>
+      <w:r>
+        <w:t>) module is a built-in Node.js module used to work with files and directories.</w:t>
+      </w:r>
+    </w:p>
+    <w:p>
+      <w:pPr>
+        <w:spacing w:line="240" w:lineRule="auto"/>
+        <w:jc w:val="both"/>
+      </w:pPr>
+      <w:r>
+        <w:t>We can:</w:t>
+      </w:r>
+    </w:p>
+    <w:p>
+      <w:pPr>
+        <w:numPr>
+          <w:ilvl w:val="0"/>
+          <w:numId w:val="14"/>
+        </w:numPr>
+        <w:spacing w:line="240" w:lineRule="auto"/>
+        <w:jc w:val="both"/>
+      </w:pPr>
+      <w:r>
+        <w:t xml:space="preserve">Create files </w:t>
+      </w:r>
+    </w:p>
+    <w:p>
+      <w:pPr>
+        <w:numPr>
+          <w:ilvl w:val="0"/>
+          <w:numId w:val="14"/>
+        </w:numPr>
+        <w:spacing w:line="240" w:lineRule="auto"/>
+        <w:jc w:val="both"/>
+      </w:pPr>
+      <w:r>
+        <w:t xml:space="preserve">Read files </w:t>
+      </w:r>
+    </w:p>
+    <w:p>
+      <w:pPr>
+        <w:numPr>
+          <w:ilvl w:val="0"/>
+          <w:numId w:val="14"/>
+        </w:numPr>
+        <w:spacing w:line="240" w:lineRule="auto"/>
+        <w:jc w:val="both"/>
+      </w:pPr>
+      <w:r>
+        <w:t xml:space="preserve">Update files </w:t>
+      </w:r>
+    </w:p>
+    <w:p>
+      <w:pPr>
+        <w:numPr>
+          <w:ilvl w:val="0"/>
+          <w:numId w:val="14"/>
+        </w:numPr>
+        <w:spacing w:line="240" w:lineRule="auto"/>
+        <w:jc w:val="both"/>
+      </w:pPr>
+      <w:r>
+        <w:t xml:space="preserve">Delete files </w:t>
+      </w:r>
+    </w:p>
+    <w:p>
+      <w:pPr>
+        <w:numPr>
+          <w:ilvl w:val="0"/>
+          <w:numId w:val="14"/>
+        </w:numPr>
+        <w:spacing w:line="240" w:lineRule="auto"/>
+        <w:jc w:val="both"/>
+      </w:pPr>
+      <w:r>
+        <w:t xml:space="preserve">Rename files </w:t>
+      </w:r>
+    </w:p>
+    <w:p>
+      <w:pPr>
+        <w:spacing w:line="240" w:lineRule="auto"/>
+        <w:jc w:val="both"/>
+      </w:pPr>
+      <w:r>
+        <w:rPr>
+          <w:b/>
+          <w:bCs/>
+        </w:rPr>
+        <w:t>Example:</w:t>
+      </w:r>
+    </w:p>
+    <w:p>
+      <w:pPr>
+        <w:spacing w:line="240" w:lineRule="auto"/>
+        <w:jc w:val="both"/>
+      </w:pPr>
+      <w:proofErr w:type="spellStart"/>
+      <w:r>
+        <w:t>const</w:t>
+      </w:r>
+      <w:proofErr w:type="spellEnd"/>
+      <w:r>
+        <w:t xml:space="preserve"> fs = require("fs");</w:t>
+      </w:r>
+    </w:p>
+    <w:p>
+      <w:pPr>
+        <w:spacing w:line="240" w:lineRule="auto"/>
+        <w:jc w:val="both"/>
+      </w:pPr>
+    </w:p>
+    <w:p>
+      <w:pPr>
+        <w:spacing w:line="240" w:lineRule="auto"/>
+        <w:jc w:val="both"/>
+      </w:pPr>
+      <w:proofErr w:type="spellStart"/>
+      <w:proofErr w:type="gramStart"/>
+      <w:r>
+        <w:t>fs.writeFile</w:t>
+      </w:r>
+      <w:proofErr w:type="spellEnd"/>
+      <w:proofErr w:type="gramEnd"/>
+      <w:r>
+        <w:t>("data.txt", "Hello Node.js", (err) =&gt; {</w:t>
+      </w:r>
+    </w:p>
+    <w:p>
+      <w:pPr>
+        <w:spacing w:line="240" w:lineRule="auto"/>
+        <w:jc w:val="both"/>
+      </w:pPr>
+      <w:r>
+        <w:t xml:space="preserve">    if (err) {</w:t>
+      </w:r>
+    </w:p>
+    <w:p>
+      <w:pPr>
+        <w:spacing w:line="240" w:lineRule="auto"/>
+        <w:jc w:val="both"/>
+      </w:pPr>
+      <w:r>
+        <w:t xml:space="preserve">        console.log(err);</w:t>
+      </w:r>
+    </w:p>
+    <w:p>
+      <w:pPr>
+        <w:spacing w:line="240" w:lineRule="auto"/>
+        <w:jc w:val="both"/>
+      </w:pPr>
+      <w:r>
+        <w:t xml:space="preserve">        return;</w:t>
+      </w:r>
+    </w:p>
+    <w:p>
+      <w:pPr>
+        <w:spacing w:line="240" w:lineRule="auto"/>
+        <w:jc w:val="both"/>
+      </w:pPr>
+      <w:r>
+        <w:t xml:space="preserve">    }</w:t>
+      </w:r>
+    </w:p>
+    <w:p>
+      <w:pPr>
+        <w:spacing w:line="240" w:lineRule="auto"/>
+        <w:jc w:val="both"/>
+      </w:pPr>
+    </w:p>
+    <w:p>
+      <w:pPr>
+        <w:spacing w:line="240" w:lineRule="auto"/>
+        <w:jc w:val="both"/>
+      </w:pPr>
+      <w:r>
+        <w:t xml:space="preserve">    </w:t>
+      </w:r>
+      <w:proofErr w:type="gramStart"/>
+      <w:r>
+        <w:t>console.log(</w:t>
+      </w:r>
+      <w:proofErr w:type="gramEnd"/>
+      <w:r>
+        <w:t>"File created");</w:t>
+      </w:r>
+    </w:p>
+    <w:p>
+      <w:pPr>
+        <w:spacing w:line="240" w:lineRule="auto"/>
+        <w:jc w:val="both"/>
+      </w:pPr>
+      <w:r>
+        <w:t>});</w:t>
+      </w:r>
+    </w:p>
+    <w:p>
+      <w:pPr>
+        <w:spacing w:line="240" w:lineRule="auto"/>
+        <w:jc w:val="both"/>
+      </w:pPr>
+      <w:r>
+        <w:pict w14:anchorId="3D4B40A6">
+          <v:rect id="_x0000_i1094" style="width:468pt;height:1.5pt" o:hralign="center" o:hrstd="t" o:hr="t" fillcolor="#a0a0a0" stroked="f"/>
+        </w:pict>
+      </w:r>
+    </w:p>
+    <w:p>
+      <w:pPr>
+        <w:spacing w:line="240" w:lineRule="auto"/>
+        <w:jc w:val="both"/>
+        <w:rPr>
+          <w:b/>
+          <w:bCs/>
+        </w:rPr>
+      </w:pPr>
+      <w:r>
+        <w:rPr>
+          <w:b/>
+          <w:bCs/>
+        </w:rPr>
+        <w:t>17. What is the http module in Node.js?</w:t>
+      </w:r>
+    </w:p>
+    <w:p>
+      <w:pPr>
+        <w:spacing w:line="240" w:lineRule="auto"/>
+        <w:jc w:val="both"/>
+      </w:pPr>
+      <w:r>
+        <w:rPr>
+          <w:b/>
+          <w:bCs/>
+        </w:rPr>
+        <w:lastRenderedPageBreak/>
+        <w:t>Answer:</w:t>
+      </w:r>
+      <w:r>
+        <w:br/>
+        <w:t>The http module is a built-in Node.js module used to create an HTTP server and handle HTTP requests and responses.</w:t>
+      </w:r>
+    </w:p>
+    <w:p>
+      <w:pPr>
+        <w:spacing w:line="240" w:lineRule="auto"/>
+        <w:jc w:val="both"/>
+      </w:pPr>
+      <w:r>
+        <w:rPr>
+          <w:b/>
+          <w:bCs/>
+        </w:rPr>
+        <w:t>Example:</w:t>
+      </w:r>
+    </w:p>
+    <w:p>
+      <w:pPr>
+        <w:spacing w:line="240" w:lineRule="auto"/>
+        <w:jc w:val="both"/>
+      </w:pPr>
+      <w:proofErr w:type="spellStart"/>
+      <w:r>
+        <w:t>const</w:t>
+      </w:r>
+      <w:proofErr w:type="spellEnd"/>
+      <w:r>
+        <w:t xml:space="preserve"> http = require("http");</w:t>
+      </w:r>
+    </w:p>
+    <w:p>
+      <w:pPr>
+        <w:spacing w:line="240" w:lineRule="auto"/>
+        <w:jc w:val="both"/>
+      </w:pPr>
+    </w:p>
+    <w:p>
+      <w:pPr>
+        <w:spacing w:line="240" w:lineRule="auto"/>
+        <w:jc w:val="both"/>
+      </w:pPr>
+      <w:proofErr w:type="spellStart"/>
+      <w:r>
+        <w:t>const</w:t>
+      </w:r>
+      <w:proofErr w:type="spellEnd"/>
+      <w:r>
+        <w:t xml:space="preserve"> server = </w:t>
+      </w:r>
+      <w:proofErr w:type="spellStart"/>
+      <w:proofErr w:type="gramStart"/>
+      <w:r>
+        <w:t>http.createServer</w:t>
+      </w:r>
+      <w:proofErr w:type="spellEnd"/>
+      <w:proofErr w:type="gramEnd"/>
+      <w:r>
+        <w:t>((</w:t>
+      </w:r>
+      <w:proofErr w:type="spellStart"/>
+      <w:r>
+        <w:t>req</w:t>
+      </w:r>
+      <w:proofErr w:type="spellEnd"/>
+      <w:r>
+        <w:t>, res) =&gt; {</w:t>
+      </w:r>
+    </w:p>
+    <w:p>
+      <w:pPr>
+        <w:spacing w:line="240" w:lineRule="auto"/>
+        <w:jc w:val="both"/>
+      </w:pPr>
+      <w:r>
+        <w:t xml:space="preserve">    </w:t>
+      </w:r>
+      <w:proofErr w:type="spellStart"/>
+      <w:proofErr w:type="gramStart"/>
+      <w:r>
+        <w:t>res.write</w:t>
+      </w:r>
+      <w:proofErr w:type="spellEnd"/>
+      <w:proofErr w:type="gramEnd"/>
+      <w:r>
+        <w:t>("Hello Node.js");</w:t>
+      </w:r>
+    </w:p>
+    <w:p>
+      <w:pPr>
+        <w:spacing w:line="240" w:lineRule="auto"/>
+        <w:jc w:val="both"/>
+      </w:pPr>
+      <w:r>
+        <w:t xml:space="preserve">    </w:t>
+      </w:r>
+      <w:proofErr w:type="spellStart"/>
+      <w:proofErr w:type="gramStart"/>
+      <w:r>
+        <w:t>res.end</w:t>
+      </w:r>
+      <w:proofErr w:type="spellEnd"/>
+      <w:r>
+        <w:t>(</w:t>
+      </w:r>
+      <w:proofErr w:type="gramEnd"/>
+      <w:r>
+        <w:t>);</w:t>
+      </w:r>
+    </w:p>
+    <w:p>
+      <w:pPr>
+        <w:spacing w:line="240" w:lineRule="auto"/>
+        <w:jc w:val="both"/>
+      </w:pPr>
+      <w:r>
+        <w:t>});</w:t>
+      </w:r>
+    </w:p>
+    <w:p>
+      <w:pPr>
+        <w:spacing w:line="240" w:lineRule="auto"/>
+        <w:jc w:val="both"/>
+      </w:pPr>
+    </w:p>
+    <w:p>
+      <w:pPr>
+        <w:spacing w:line="240" w:lineRule="auto"/>
+        <w:jc w:val="both"/>
+      </w:pPr>
+      <w:proofErr w:type="spellStart"/>
+      <w:proofErr w:type="gramStart"/>
+      <w:r>
+        <w:t>server.listen</w:t>
+      </w:r>
+      <w:proofErr w:type="spellEnd"/>
+      <w:proofErr w:type="gramEnd"/>
+      <w:r>
+        <w:t>(5000, () =&gt; {</w:t>
+      </w:r>
+    </w:p>
+    <w:p>
+      <w:pPr>
+        <w:spacing w:line="240" w:lineRule="auto"/>
+        <w:jc w:val="both"/>
+      </w:pPr>
+      <w:r>
+        <w:t xml:space="preserve">    </w:t>
+      </w:r>
+      <w:proofErr w:type="gramStart"/>
+      <w:r>
+        <w:t>console.log(</w:t>
+      </w:r>
+      <w:proofErr w:type="gramEnd"/>
+      <w:r>
+        <w:t>"Server running on port 5000");</w:t>
+      </w:r>
+    </w:p>
+    <w:p>
+      <w:pPr>
+        <w:spacing w:line="240" w:lineRule="auto"/>
+        <w:jc w:val="both"/>
+      </w:pPr>
+      <w:r>
+        <w:t>});</w:t>
+      </w:r>
+    </w:p>
+    <w:p>
+      <w:pPr>
+        <w:spacing w:line="240" w:lineRule="auto"/>
+        <w:jc w:val="both"/>
+      </w:pPr>
+      <w:r>
+        <w:pict w14:anchorId="0AFC0383">
+          <v:rect id="_x0000_i1095" style="width:468pt;height:1.5pt" o:hralign="center" o:hrstd="t" o:hr="t" fillcolor="#a0a0a0" stroked="f"/>
+        </w:pict>
+      </w:r>
+    </w:p>
+    <w:p>
+      <w:pPr>
+        <w:spacing w:line="240" w:lineRule="auto"/>
+        <w:jc w:val="both"/>
+        <w:rPr>
+          <w:b/>
+          <w:bCs/>
+        </w:rPr>
+      </w:pPr>
+      <w:r>
+        <w:rPr>
+          <w:b/>
+          <w:bCs/>
+        </w:rPr>
+        <w:t xml:space="preserve">18. What is the difference between dependencies and </w:t>
+      </w:r>
+      <w:proofErr w:type="spellStart"/>
+      <w:r>
+        <w:rPr>
+          <w:b/>
+          <w:bCs/>
+        </w:rPr>
+        <w:t>devDependencies</w:t>
+      </w:r>
+      <w:proofErr w:type="spellEnd"/>
+      <w:r>
+        <w:rPr>
+          <w:b/>
+          <w:bCs/>
+        </w:rPr>
+        <w:t>?</w:t>
+      </w:r>
+    </w:p>
+    <w:p>
+      <w:pPr>
+        <w:spacing w:line="240" w:lineRule="auto"/>
+        <w:jc w:val="both"/>
+      </w:pPr>
+      <w:r>
+        <w:rPr>
+          <w:b/>
+          <w:bCs/>
+        </w:rPr>
+        <w:t>Answer:</w:t>
+      </w:r>
+    </w:p>
+    <w:p>
+      <w:pPr>
+        <w:spacing w:line="240" w:lineRule="auto"/>
+        <w:jc w:val="both"/>
+      </w:pPr>
+      <w:r>
+        <w:rPr>
+          <w:b/>
+          <w:bCs/>
+        </w:rPr>
+        <w:t>dependencies:</w:t>
+      </w:r>
+      <w:r>
+        <w:br/>
+        <w:t>Packages required when the application runs in production.</w:t>
+      </w:r>
+    </w:p>
+    <w:p>
+      <w:pPr>
+        <w:spacing w:line="240" w:lineRule="auto"/>
+        <w:jc w:val="both"/>
+      </w:pPr>
+      <w:r>
+        <w:t>Example:</w:t>
+      </w:r>
+    </w:p>
+    <w:p>
+      <w:pPr>
+        <w:spacing w:line="240" w:lineRule="auto"/>
+        <w:jc w:val="both"/>
+      </w:pPr>
+      <w:proofErr w:type="spellStart"/>
+      <w:r>
+        <w:t>npm</w:t>
+      </w:r>
+      <w:proofErr w:type="spellEnd"/>
+      <w:r>
+        <w:t xml:space="preserve"> install express</w:t>
+      </w:r>
+    </w:p>
+    <w:p>
+      <w:pPr>
+        <w:spacing w:line="240" w:lineRule="auto"/>
+        <w:jc w:val="both"/>
+      </w:pPr>
+      <w:proofErr w:type="spellStart"/>
+      <w:r>
+        <w:rPr>
+          <w:b/>
+          <w:bCs/>
+        </w:rPr>
+        <w:t>devDependencies</w:t>
+      </w:r>
+      <w:proofErr w:type="spellEnd"/>
+      <w:r>
+        <w:rPr>
+          <w:b/>
+          <w:bCs/>
+        </w:rPr>
+        <w:t>:</w:t>
+      </w:r>
+      <w:r>
+        <w:br/>
+        <w:t>Packages mainly required during development.</w:t>
+      </w:r>
+    </w:p>
+    <w:p>
+      <w:pPr>
+        <w:spacing w:line="240" w:lineRule="auto"/>
+        <w:jc w:val="both"/>
+      </w:pPr>
+      <w:r>
+        <w:t>Example:</w:t>
+      </w:r>
+    </w:p>
+    <w:p>
+      <w:pPr>
+        <w:spacing w:line="240" w:lineRule="auto"/>
+        <w:jc w:val="both"/>
+      </w:pPr>
+      <w:proofErr w:type="spellStart"/>
+      <w:r>
+        <w:t>npm</w:t>
+      </w:r>
+      <w:proofErr w:type="spellEnd"/>
+      <w:r>
+        <w:t xml:space="preserve"> install </w:t>
+      </w:r>
+      <w:proofErr w:type="spellStart"/>
+      <w:r>
+        <w:t>nodemon</w:t>
+      </w:r>
+      <w:proofErr w:type="spellEnd"/>
+      <w:r>
+        <w:t xml:space="preserve"> --save-dev</w:t>
+      </w:r>
+    </w:p>
+    <w:p>
+      <w:pPr>
+        <w:spacing w:line="240" w:lineRule="auto"/>
+        <w:jc w:val="both"/>
+      </w:pPr>
+      <w:r>
+        <w:t xml:space="preserve">They are stored in </w:t>
+      </w:r>
+      <w:proofErr w:type="spellStart"/>
+      <w:proofErr w:type="gramStart"/>
+      <w:r>
+        <w:t>package.json</w:t>
+      </w:r>
+      <w:proofErr w:type="spellEnd"/>
+      <w:proofErr w:type="gramEnd"/>
+      <w:r>
+        <w:t>:</w:t>
+      </w:r>
+    </w:p>
+    <w:p>
+      <w:pPr>
+        <w:spacing w:line="240" w:lineRule="auto"/>
+        <w:jc w:val="both"/>
+      </w:pPr>
+      <w:r>
+        <w:t>{</w:t>
+      </w:r>
+    </w:p>
+    <w:p>
+      <w:pPr>
+        <w:spacing w:line="240" w:lineRule="auto"/>
+        <w:jc w:val="both"/>
+      </w:pPr>
+      <w:r>
+        <w:t xml:space="preserve">  "dependencies": {</w:t>
+      </w:r>
+    </w:p>
+    <w:p>
+      <w:pPr>
+        <w:spacing w:line="240" w:lineRule="auto"/>
+        <w:jc w:val="both"/>
+      </w:pPr>
+      <w:r>
+        <w:t xml:space="preserve">    "express": "^5.1.0"</w:t>
+      </w:r>
+    </w:p>
+    <w:p>
+      <w:pPr>
+        <w:spacing w:line="240" w:lineRule="auto"/>
+        <w:jc w:val="both"/>
+      </w:pPr>
+      <w:r>
+        <w:t xml:space="preserve">  },</w:t>
+      </w:r>
+    </w:p>
+    <w:p>
+      <w:pPr>
+        <w:spacing w:line="240" w:lineRule="auto"/>
+        <w:jc w:val="both"/>
+      </w:pPr>
+      <w:r>
+        <w:t xml:space="preserve">  "</w:t>
+      </w:r>
+      <w:proofErr w:type="spellStart"/>
+      <w:r>
+        <w:t>devDependencies</w:t>
+      </w:r>
+      <w:proofErr w:type="spellEnd"/>
+      <w:r>
+        <w:t>": {</w:t>
+      </w:r>
+    </w:p>
+    <w:p>
+      <w:pPr>
+        <w:spacing w:line="240" w:lineRule="auto"/>
+        <w:jc w:val="both"/>
+      </w:pPr>
+      <w:r>
+        <w:t xml:space="preserve">    "</w:t>
+      </w:r>
+      <w:proofErr w:type="spellStart"/>
+      <w:r>
+        <w:t>nodemon</w:t>
+      </w:r>
+      <w:proofErr w:type="spellEnd"/>
+      <w:r>
+        <w:t>": "^3.0.0"</w:t>
+      </w:r>
+    </w:p>
+    <w:p>
+      <w:pPr>
+        <w:spacing w:line="240" w:lineRule="auto"/>
+        <w:jc w:val="both"/>
+      </w:pPr>
+      <w:r>
+        <w:lastRenderedPageBreak/>
+        <w:t xml:space="preserve">  }</w:t>
+      </w:r>
+    </w:p>
+    <w:p>
+      <w:pPr>
+        <w:spacing w:line="240" w:lineRule="auto"/>
+        <w:jc w:val="both"/>
+      </w:pPr>
+      <w:r>
+        <w:t>}</w:t>
+      </w:r>
+    </w:p>
+    <w:p>
+      <w:pPr>
+        <w:spacing w:line="240" w:lineRule="auto"/>
+        <w:jc w:val="both"/>
+      </w:pPr>
+      <w:r>
+        <w:pict w14:anchorId="011F7EF4">
+          <v:rect id="_x0000_i1096" style="width:468pt;height:1.5pt" o:hralign="center" o:hrstd="t" o:hr="t" fillcolor="#a0a0a0" stroked="f"/>
+        </w:pict>
+      </w:r>
+    </w:p>
+    <w:p>
+      <w:pPr>
+        <w:spacing w:line="240" w:lineRule="auto"/>
+        <w:jc w:val="both"/>
+        <w:rPr>
+          <w:b/>
+          <w:bCs/>
+        </w:rPr>
+      </w:pPr>
+      <w:r>
+        <w:rPr>
+          <w:b/>
+          <w:bCs/>
+        </w:rPr>
+        <w:t xml:space="preserve">19. What is </w:t>
+      </w:r>
+      <w:proofErr w:type="spellStart"/>
+      <w:r>
+        <w:rPr>
+          <w:b/>
+          <w:bCs/>
+        </w:rPr>
+        <w:t>nodemon</w:t>
+      </w:r>
+      <w:proofErr w:type="spellEnd"/>
+      <w:r>
+        <w:rPr>
+          <w:b/>
+          <w:bCs/>
+        </w:rPr>
+        <w:t>?</w:t>
+      </w:r>
+    </w:p>
+    <w:p>
+      <w:pPr>
+        <w:spacing w:line="240" w:lineRule="auto"/>
+        <w:jc w:val="both"/>
+      </w:pPr>
+      <w:r>
+        <w:rPr>
+          <w:b/>
+          <w:bCs/>
+        </w:rPr>
+        <w:t>Answer:</w:t>
+      </w:r>
+      <w:r>
+        <w:br/>
+      </w:r>
+      <w:proofErr w:type="spellStart"/>
+      <w:r>
+        <w:t>nodemon</w:t>
+      </w:r>
+      <w:proofErr w:type="spellEnd"/>
+      <w:r>
+        <w:t xml:space="preserve"> is a development tool that automatically restarts the Node.js application whenever files are changed.</w:t>
+      </w:r>
+    </w:p>
+    <w:p>
+      <w:pPr>
+        <w:spacing w:line="240" w:lineRule="auto"/>
+        <w:jc w:val="both"/>
+      </w:pPr>
+      <w:r>
+        <w:t>Instead of:</w:t>
+      </w:r>
+    </w:p>
+    <w:p>
+      <w:pPr>
+        <w:spacing w:line="240" w:lineRule="auto"/>
+        <w:jc w:val="both"/>
+      </w:pPr>
+      <w:r>
+        <w:t>node server.js</w:t>
+      </w:r>
+    </w:p>
+    <w:p>
+      <w:pPr>
+        <w:spacing w:line="240" w:lineRule="auto"/>
+        <w:jc w:val="both"/>
+      </w:pPr>
+      <w:r>
+        <w:t>we can use:</w:t>
+      </w:r>
+    </w:p>
+    <w:p>
+      <w:pPr>
+        <w:spacing w:line="240" w:lineRule="auto"/>
+        <w:jc w:val="both"/>
+      </w:pPr>
+      <w:proofErr w:type="spellStart"/>
+      <w:r>
+        <w:t>nodemon</w:t>
+      </w:r>
+      <w:proofErr w:type="spellEnd"/>
+      <w:r>
+        <w:t xml:space="preserve"> server.js</w:t>
+      </w:r>
+    </w:p>
+    <w:p>
+      <w:pPr>
+        <w:spacing w:line="240" w:lineRule="auto"/>
+        <w:jc w:val="both"/>
+      </w:pPr>
+      <w:r>
+        <w:t>Install it as a development dependency:</w:t>
+      </w:r>
+    </w:p>
+    <w:p>
+      <w:pPr>
+        <w:spacing w:line="240" w:lineRule="auto"/>
+        <w:jc w:val="both"/>
+      </w:pPr>
+      <w:proofErr w:type="spellStart"/>
+      <w:r>
+        <w:t>npm</w:t>
+      </w:r>
+      <w:proofErr w:type="spellEnd"/>
+      <w:r>
+        <w:t xml:space="preserve"> install </w:t>
+      </w:r>
+      <w:proofErr w:type="spellStart"/>
+      <w:r>
+        <w:t>nodemon</w:t>
+      </w:r>
+      <w:proofErr w:type="spellEnd"/>
+      <w:r>
+        <w:t xml:space="preserve"> --save-dev</w:t>
+      </w:r>
+    </w:p>
+    <w:p>
+      <w:pPr>
+        <w:spacing w:line="240" w:lineRule="auto"/>
+        <w:jc w:val="both"/>
+      </w:pPr>
+      <w:r>
+        <w:rPr>
+          <w:b/>
+          <w:bCs/>
+        </w:rPr>
+        <w:t>Interview answer:</w:t>
+      </w:r>
+    </w:p>
+    <w:p>
+      <w:pPr>
+        <w:spacing w:line="240" w:lineRule="auto"/>
+        <w:jc w:val="both"/>
+      </w:pPr>
+      <w:proofErr w:type="spellStart"/>
+      <w:r>
+        <w:t>Nodemon</w:t>
+      </w:r>
+      <w:proofErr w:type="spellEnd"/>
+      <w:r>
+        <w:t xml:space="preserve"> improves development productivity by automatically restarting the Node.js server when source files change.</w:t>
+      </w:r>
+    </w:p>
+    <w:p>
+      <w:pPr>
+        <w:spacing w:line="240" w:lineRule="auto"/>
+        <w:jc w:val="both"/>
+      </w:pPr>
+      <w:r>
+        <w:pict w14:anchorId="3055F942">
+          <v:rect id="_x0000_i1097" style="width:468pt;height:1.5pt" o:hralign="center" o:hrstd="t" o:hr="t" fillcolor="#a0a0a0" stroked="f"/>
+        </w:pict>
+      </w:r>
+    </w:p>
+    <w:p>
+      <w:pPr>
+        <w:spacing w:line="240" w:lineRule="auto"/>
+        <w:jc w:val="both"/>
+        <w:rPr>
+          <w:b/>
+          <w:bCs/>
+        </w:rPr>
+      </w:pPr>
+      <w:r>
+        <w:rPr>
+          <w:b/>
+          <w:bCs/>
+        </w:rPr>
+        <w:t xml:space="preserve">20. What is the difference between </w:t>
+      </w:r>
+      <w:proofErr w:type="spellStart"/>
+      <w:r>
+        <w:rPr>
+          <w:b/>
+          <w:bCs/>
+        </w:rPr>
+        <w:t>npm</w:t>
+      </w:r>
+      <w:proofErr w:type="spellEnd"/>
+      <w:r>
+        <w:rPr>
+          <w:b/>
+          <w:bCs/>
+        </w:rPr>
+        <w:t xml:space="preserve"> install and </w:t>
+      </w:r>
+      <w:proofErr w:type="spellStart"/>
+      <w:r>
+        <w:rPr>
+          <w:b/>
+          <w:bCs/>
+        </w:rPr>
+        <w:t>npm</w:t>
+      </w:r>
+      <w:proofErr w:type="spellEnd"/>
+      <w:r>
+        <w:rPr>
+          <w:b/>
+          <w:bCs/>
+        </w:rPr>
+        <w:t xml:space="preserve"> install --save-dev?</w:t>
+      </w:r>
+    </w:p>
+    <w:p>
+      <w:pPr>
+        <w:spacing w:line="240" w:lineRule="auto"/>
+        <w:jc w:val="both"/>
+      </w:pPr>
+      <w:r>
+        <w:rPr>
+          <w:b/>
+          <w:bCs/>
+        </w:rPr>
+        <w:t>Answer:</w:t>
+      </w:r>
+    </w:p>
+    <w:p>
+      <w:pPr>
+        <w:spacing w:line="240" w:lineRule="auto"/>
+        <w:jc w:val="both"/>
+      </w:pPr>
+      <w:proofErr w:type="spellStart"/>
+      <w:r>
+        <w:t>npm</w:t>
+      </w:r>
+      <w:proofErr w:type="spellEnd"/>
+      <w:r>
+        <w:t xml:space="preserve"> install installs a package as a </w:t>
+      </w:r>
+      <w:r>
+        <w:rPr>
+          <w:b/>
+          <w:bCs/>
+        </w:rPr>
+        <w:t>production dependency</w:t>
+      </w:r>
+      <w:r>
+        <w:t>.</w:t>
+      </w:r>
+    </w:p>
+    <w:p>
+      <w:pPr>
+        <w:spacing w:line="240" w:lineRule="auto"/>
+        <w:jc w:val="both"/>
+      </w:pPr>
+      <w:proofErr w:type="spellStart"/>
+      <w:r>
+        <w:t>npm</w:t>
+      </w:r>
+      <w:proofErr w:type="spellEnd"/>
+      <w:r>
+        <w:t xml:space="preserve"> install express</w:t>
+      </w:r>
+    </w:p>
+    <w:p>
+      <w:pPr>
+        <w:spacing w:line="240" w:lineRule="auto"/>
+        <w:jc w:val="both"/>
+      </w:pPr>
+      <w:r>
+        <w:t>It is added to:</w:t>
+      </w:r>
+    </w:p>
+    <w:p>
+      <w:pPr>
+        <w:spacing w:line="240" w:lineRule="auto"/>
+        <w:jc w:val="both"/>
+      </w:pPr>
+      <w:r>
+        <w:t>"dependencies": {}</w:t>
+      </w:r>
+    </w:p>
+    <w:p>
+      <w:pPr>
+        <w:spacing w:line="240" w:lineRule="auto"/>
+        <w:jc w:val="both"/>
+      </w:pPr>
+      <w:proofErr w:type="spellStart"/>
+      <w:r>
+        <w:t>npm</w:t>
+      </w:r>
+      <w:proofErr w:type="spellEnd"/>
+      <w:r>
+        <w:t xml:space="preserve"> install --save-dev installs a package as a </w:t>
+      </w:r>
+      <w:r>
+        <w:rPr>
+          <w:b/>
+          <w:bCs/>
+        </w:rPr>
+        <w:t>development dependency</w:t>
+      </w:r>
+      <w:r>
+        <w:t>.</w:t>
+      </w:r>
+    </w:p>
+    <w:p>
+      <w:pPr>
+        <w:spacing w:line="240" w:lineRule="auto"/>
+        <w:jc w:val="both"/>
+      </w:pPr>
+      <w:proofErr w:type="spellStart"/>
+      <w:r>
+        <w:t>npm</w:t>
+      </w:r>
+      <w:proofErr w:type="spellEnd"/>
+      <w:r>
+        <w:t xml:space="preserve"> install </w:t>
+      </w:r>
+      <w:proofErr w:type="spellStart"/>
+      <w:r>
+        <w:t>nodemon</w:t>
+      </w:r>
+      <w:proofErr w:type="spellEnd"/>
+      <w:r>
+        <w:t xml:space="preserve"> --save-dev</w:t>
+      </w:r>
+    </w:p>
+    <w:p>
+      <w:pPr>
+        <w:spacing w:line="240" w:lineRule="auto"/>
+        <w:jc w:val="both"/>
+      </w:pPr>
+      <w:r>
+        <w:t>It is added to:</w:t>
+      </w:r>
+    </w:p>
+    <w:p>
+      <w:pPr>
+        <w:spacing w:line="240" w:lineRule="auto"/>
+        <w:jc w:val="both"/>
+      </w:pPr>
+      <w:r>
+        <w:t>"</w:t>
+      </w:r>
+      <w:proofErr w:type="spellStart"/>
+      <w:r>
+        <w:t>devDependencies</w:t>
+      </w:r>
+      <w:proofErr w:type="spellEnd"/>
+      <w:r>
+        <w:t>": {}</w:t>
+      </w:r>
+    </w:p>
+    <w:p>
+      <w:pPr>
+        <w:spacing w:line="240" w:lineRule="auto"/>
+        <w:jc w:val="both"/>
+        <w:rPr>
+          <w:b/>
+          <w:bCs/>
+        </w:rPr>
+      </w:pPr>
+      <w:r>
+        <w:rPr>
+          <w:rFonts w:ascii="Segoe UI Emoji" w:hAnsi="Segoe UI Emoji" w:cs="Segoe UI Emoji"/>
+          <w:b/>
+          <w:bCs/>
+        </w:rPr>
+        <w:t>⭐</w:t>
+      </w:r>
+      <w:r>
+        <w:rPr>
+          <w:b/>
+          <w:bCs/>
+        </w:rPr>
+        <w:t xml:space="preserve"> Interview Tip</w:t>
+      </w:r>
+    </w:p>
+    <w:p>
+      <w:pPr>
+        <w:spacing w:line="240" w:lineRule="auto"/>
+        <w:jc w:val="both"/>
+      </w:pPr>
+      <w:r>
+        <w:t xml:space="preserve">For your </w:t>
+      </w:r>
+      <w:r>
+        <w:rPr>
+          <w:b/>
+          <w:bCs/>
+        </w:rPr>
+        <w:t>MERN Stack interview</w:t>
+      </w:r>
+      <w:r>
+        <w:t xml:space="preserve">, be especially comfortable with </w:t>
+      </w:r>
+      <w:r>
+        <w:rPr>
+          <w:b/>
+          <w:bCs/>
+        </w:rPr>
+        <w:t xml:space="preserve">Promises, async/await, callbacks, Event Loop, fs, HTTP, </w:t>
+      </w:r>
+      <w:proofErr w:type="spellStart"/>
+      <w:r>
+        <w:rPr>
+          <w:b/>
+          <w:bCs/>
+        </w:rPr>
+        <w:t>npm</w:t>
+      </w:r>
+      <w:proofErr w:type="spellEnd"/>
+      <w:r>
+        <w:rPr>
+          <w:b/>
+          <w:bCs/>
+        </w:rPr>
+        <w:t>, and dependencies</w:t>
+      </w:r>
+      <w:r>
+        <w:t>. These are common areas for follow-up questions.</w:t>
+      </w:r>
+    </w:p>
+    <w:p>
+      <w:pPr>
+        <w:spacing w:line="240" w:lineRule="auto"/>
+        <w:jc w:val="both"/>
+        <w:rPr>
+          <w:vanish/>
+        </w:rPr>
+      </w:pPr>
+    </w:p>
+    <w:p>
+      <w:pPr>
+        <w:spacing w:line="240" w:lineRule="auto"/>
+        <w:jc w:val="both"/>
+      </w:pPr>
+    </w:p>
+    <w:p>
+      <w:pPr>
+        <w:spacing w:line="240" w:lineRule="auto"/>
+        <w:jc w:val="both"/>
       </w:pPr>
     </w:p>
     <w:sectPr>
@@ -2473,6 +5039,155 @@
     </w:lvl>
   </w:abstractNum>
   <w:abstractNum w:abstractNumId="3" w15:restartNumberingAfterBreak="0">
+    <w:nsid w:val="1B955969"/>
+    <w:multiLevelType w:val="multilevel"/>
+    <w:tmpl w:val="C910FA44"/>
+    <w:lvl w:ilvl="0">
+      <w:start w:val="1"/>
+      <w:numFmt w:val="bullet"/>
+      <w:lvlText w:val=""/>
+      <w:lvlJc w:val="left"/>
+      <w:pPr>
+        <w:tabs>
+          <w:tab w:val="num" w:pos="720"/>
+        </w:tabs>
+        <w:ind w:left="720" w:hanging="360"/>
+      </w:pPr>
+      <w:rPr>
+        <w:rFonts w:ascii="Symbol" w:hAnsi="Symbol" w:hint="default"/>
+        <w:sz w:val="20"/>
+      </w:rPr>
+    </w:lvl>
+    <w:lvl w:ilvl="1">
+      <w:start w:val="1"/>
+      <w:numFmt w:val="bullet"/>
+      <w:lvlText w:val="o"/>
+      <w:lvlJc w:val="left"/>
+      <w:pPr>
+        <w:tabs>
+          <w:tab w:val="num" w:pos="1440"/>
+        </w:tabs>
+        <w:ind w:left="1440" w:hanging="360"/>
+      </w:pPr>
+      <w:rPr>
+        <w:rFonts w:ascii="Courier New" w:hAnsi="Courier New" w:cs="Times New Roman" w:hint="default"/>
+        <w:sz w:val="20"/>
+      </w:rPr>
+    </w:lvl>
+    <w:lvl w:ilvl="2">
+      <w:start w:val="1"/>
+      <w:numFmt w:val="bullet"/>
+      <w:lvlText w:val=""/>
+      <w:lvlJc w:val="left"/>
+      <w:pPr>
+        <w:tabs>
+          <w:tab w:val="num" w:pos="2160"/>
+        </w:tabs>
+        <w:ind w:left="2160" w:hanging="360"/>
+      </w:pPr>
+      <w:rPr>
+        <w:rFonts w:ascii="Wingdings" w:hAnsi="Wingdings" w:hint="default"/>
+        <w:sz w:val="20"/>
+      </w:rPr>
+    </w:lvl>
+    <w:lvl w:ilvl="3">
+      <w:start w:val="1"/>
+      <w:numFmt w:val="bullet"/>
+      <w:lvlText w:val=""/>
+      <w:lvlJc w:val="left"/>
+      <w:pPr>
+        <w:tabs>
+          <w:tab w:val="num" w:pos="2880"/>
+        </w:tabs>
+        <w:ind w:left="2880" w:hanging="360"/>
+      </w:pPr>
+      <w:rPr>
+        <w:rFonts w:ascii="Wingdings" w:hAnsi="Wingdings" w:hint="default"/>
+        <w:sz w:val="20"/>
+      </w:rPr>
+    </w:lvl>
+    <w:lvl w:ilvl="4">
+      <w:start w:val="1"/>
+      <w:numFmt w:val="bullet"/>
+      <w:lvlText w:val=""/>
+      <w:lvlJc w:val="left"/>
+      <w:pPr>
+        <w:tabs>
+          <w:tab w:val="num" w:pos="3600"/>
+        </w:tabs>
+        <w:ind w:left="3600" w:hanging="360"/>
+      </w:pPr>
+      <w:rPr>
+        <w:rFonts w:ascii="Wingdings" w:hAnsi="Wingdings" w:hint="default"/>
+        <w:sz w:val="20"/>
+      </w:rPr>
+    </w:lvl>
+    <w:lvl w:ilvl="5">
+      <w:start w:val="1"/>
+      <w:numFmt w:val="bullet"/>
+      <w:lvlText w:val=""/>
+      <w:lvlJc w:val="left"/>
+      <w:pPr>
+        <w:tabs>
+          <w:tab w:val="num" w:pos="4320"/>
+        </w:tabs>
+        <w:ind w:left="4320" w:hanging="360"/>
+      </w:pPr>
+      <w:rPr>
+        <w:rFonts w:ascii="Wingdings" w:hAnsi="Wingdings" w:hint="default"/>
+        <w:sz w:val="20"/>
+      </w:rPr>
+    </w:lvl>
+    <w:lvl w:ilvl="6">
+      <w:start w:val="1"/>
+      <w:numFmt w:val="bullet"/>
+      <w:lvlText w:val=""/>
+      <w:lvlJc w:val="left"/>
+      <w:pPr>
+        <w:tabs>
+          <w:tab w:val="num" w:pos="5040"/>
+        </w:tabs>
+        <w:ind w:left="5040" w:hanging="360"/>
+      </w:pPr>
+      <w:rPr>
+        <w:rFonts w:ascii="Wingdings" w:hAnsi="Wingdings" w:hint="default"/>
+        <w:sz w:val="20"/>
+      </w:rPr>
+    </w:lvl>
+    <w:lvl w:ilvl="7">
+      <w:start w:val="1"/>
+      <w:numFmt w:val="bullet"/>
+      <w:lvlText w:val=""/>
+      <w:lvlJc w:val="left"/>
+      <w:pPr>
+        <w:tabs>
+          <w:tab w:val="num" w:pos="5760"/>
+        </w:tabs>
+        <w:ind w:left="5760" w:hanging="360"/>
+      </w:pPr>
+      <w:rPr>
+        <w:rFonts w:ascii="Wingdings" w:hAnsi="Wingdings" w:hint="default"/>
+        <w:sz w:val="20"/>
+      </w:rPr>
+    </w:lvl>
+    <w:lvl w:ilvl="8">
+      <w:start w:val="1"/>
+      <w:numFmt w:val="bullet"/>
+      <w:lvlText w:val=""/>
+      <w:lvlJc w:val="left"/>
+      <w:pPr>
+        <w:tabs>
+          <w:tab w:val="num" w:pos="6480"/>
+        </w:tabs>
+        <w:ind w:left="6480" w:hanging="360"/>
+      </w:pPr>
+      <w:rPr>
+        <w:rFonts w:ascii="Wingdings" w:hAnsi="Wingdings" w:hint="default"/>
+        <w:sz w:val="20"/>
+      </w:rPr>
+    </w:lvl>
+  </w:abstractNum>
+  <w:abstractNum w:abstractNumId="4" w15:restartNumberingAfterBreak="0">
     <w:nsid w:val="21CA05B0"/>
     <w:multiLevelType w:val="multilevel"/>
     <w:tmpl w:val="B450D7E2"/>
@@ -2621,7 +5336,156 @@
       </w:rPr>
     </w:lvl>
   </w:abstractNum>
-  <w:abstractNum w:abstractNumId="4" w15:restartNumberingAfterBreak="0">
+  <w:abstractNum w:abstractNumId="5" w15:restartNumberingAfterBreak="0">
+    <w:nsid w:val="2C55743C"/>
+    <w:multiLevelType w:val="multilevel"/>
+    <w:tmpl w:val="EE862A88"/>
+    <w:lvl w:ilvl="0">
+      <w:start w:val="1"/>
+      <w:numFmt w:val="bullet"/>
+      <w:lvlText w:val=""/>
+      <w:lvlJc w:val="left"/>
+      <w:pPr>
+        <w:tabs>
+          <w:tab w:val="num" w:pos="720"/>
+        </w:tabs>
+        <w:ind w:left="720" w:hanging="360"/>
+      </w:pPr>
+      <w:rPr>
+        <w:rFonts w:ascii="Symbol" w:hAnsi="Symbol" w:hint="default"/>
+        <w:sz w:val="20"/>
+      </w:rPr>
+    </w:lvl>
+    <w:lvl w:ilvl="1">
+      <w:start w:val="1"/>
+      <w:numFmt w:val="bullet"/>
+      <w:lvlText w:val="o"/>
+      <w:lvlJc w:val="left"/>
+      <w:pPr>
+        <w:tabs>
+          <w:tab w:val="num" w:pos="1440"/>
+        </w:tabs>
+        <w:ind w:left="1440" w:hanging="360"/>
+      </w:pPr>
+      <w:rPr>
+        <w:rFonts w:ascii="Courier New" w:hAnsi="Courier New" w:cs="Times New Roman" w:hint="default"/>
+        <w:sz w:val="20"/>
+      </w:rPr>
+    </w:lvl>
+    <w:lvl w:ilvl="2">
+      <w:start w:val="1"/>
+      <w:numFmt w:val="bullet"/>
+      <w:lvlText w:val=""/>
+      <w:lvlJc w:val="left"/>
+      <w:pPr>
+        <w:tabs>
+          <w:tab w:val="num" w:pos="2160"/>
+        </w:tabs>
+        <w:ind w:left="2160" w:hanging="360"/>
+      </w:pPr>
+      <w:rPr>
+        <w:rFonts w:ascii="Wingdings" w:hAnsi="Wingdings" w:hint="default"/>
+        <w:sz w:val="20"/>
+      </w:rPr>
+    </w:lvl>
+    <w:lvl w:ilvl="3">
+      <w:start w:val="1"/>
+      <w:numFmt w:val="bullet"/>
+      <w:lvlText w:val=""/>
+      <w:lvlJc w:val="left"/>
+      <w:pPr>
+        <w:tabs>
+          <w:tab w:val="num" w:pos="2880"/>
+        </w:tabs>
+        <w:ind w:left="2880" w:hanging="360"/>
+      </w:pPr>
+      <w:rPr>
+        <w:rFonts w:ascii="Wingdings" w:hAnsi="Wingdings" w:hint="default"/>
+        <w:sz w:val="20"/>
+      </w:rPr>
+    </w:lvl>
+    <w:lvl w:ilvl="4">
+      <w:start w:val="1"/>
+      <w:numFmt w:val="bullet"/>
+      <w:lvlText w:val=""/>
+      <w:lvlJc w:val="left"/>
+      <w:pPr>
+        <w:tabs>
+          <w:tab w:val="num" w:pos="3600"/>
+        </w:tabs>
+        <w:ind w:left="3600" w:hanging="360"/>
+      </w:pPr>
+      <w:rPr>
+        <w:rFonts w:ascii="Wingdings" w:hAnsi="Wingdings" w:hint="default"/>
+        <w:sz w:val="20"/>
+      </w:rPr>
+    </w:lvl>
+    <w:lvl w:ilvl="5">
+      <w:start w:val="1"/>
+      <w:numFmt w:val="bullet"/>
+      <w:lvlText w:val=""/>
+      <w:lvlJc w:val="left"/>
+      <w:pPr>
+        <w:tabs>
+          <w:tab w:val="num" w:pos="4320"/>
+        </w:tabs>
+        <w:ind w:left="4320" w:hanging="360"/>
+      </w:pPr>
+      <w:rPr>
+        <w:rFonts w:ascii="Wingdings" w:hAnsi="Wingdings" w:hint="default"/>
+        <w:sz w:val="20"/>
+      </w:rPr>
+    </w:lvl>
+    <w:lvl w:ilvl="6">
+      <w:start w:val="1"/>
+      <w:numFmt w:val="bullet"/>
+      <w:lvlText w:val=""/>
+      <w:lvlJc w:val="left"/>
+      <w:pPr>
+        <w:tabs>
+          <w:tab w:val="num" w:pos="5040"/>
+        </w:tabs>
+        <w:ind w:left="5040" w:hanging="360"/>
+      </w:pPr>
+      <w:rPr>
+        <w:rFonts w:ascii="Wingdings" w:hAnsi="Wingdings" w:hint="default"/>
+        <w:sz w:val="20"/>
+      </w:rPr>
+    </w:lvl>
+    <w:lvl w:ilvl="7">
+      <w:start w:val="1"/>
+      <w:numFmt w:val="bullet"/>
+      <w:lvlText w:val=""/>
+      <w:lvlJc w:val="left"/>
+      <w:pPr>
+        <w:tabs>
+          <w:tab w:val="num" w:pos="5760"/>
+        </w:tabs>
+        <w:ind w:left="5760" w:hanging="360"/>
+      </w:pPr>
+      <w:rPr>
+        <w:rFonts w:ascii="Wingdings" w:hAnsi="Wingdings" w:hint="default"/>
+        <w:sz w:val="20"/>
+      </w:rPr>
+    </w:lvl>
+    <w:lvl w:ilvl="8">
+      <w:start w:val="1"/>
+      <w:numFmt w:val="bullet"/>
+      <w:lvlText w:val=""/>
+      <w:lvlJc w:val="left"/>
+      <w:pPr>
+        <w:tabs>
+          <w:tab w:val="num" w:pos="6480"/>
+        </w:tabs>
+        <w:ind w:left="6480" w:hanging="360"/>
+      </w:pPr>
+      <w:rPr>
+        <w:rFonts w:ascii="Wingdings" w:hAnsi="Wingdings" w:hint="default"/>
+        <w:sz w:val="20"/>
+      </w:rPr>
+    </w:lvl>
+  </w:abstractNum>
+  <w:abstractNum w:abstractNumId="6" w15:restartNumberingAfterBreak="0">
     <w:nsid w:val="31D6142A"/>
     <w:multiLevelType w:val="multilevel"/>
     <w:tmpl w:val="79923930"/>
@@ -2770,7 +5634,156 @@
       </w:rPr>
     </w:lvl>
   </w:abstractNum>
-  <w:abstractNum w:abstractNumId="5" w15:restartNumberingAfterBreak="0">
+  <w:abstractNum w:abstractNumId="7" w15:restartNumberingAfterBreak="0">
+    <w:nsid w:val="371571A7"/>
+    <w:multiLevelType w:val="multilevel"/>
+    <w:tmpl w:val="E3A25CA2"/>
+    <w:lvl w:ilvl="0">
+      <w:start w:val="1"/>
+      <w:numFmt w:val="bullet"/>
+      <w:lvlText w:val=""/>
+      <w:lvlJc w:val="left"/>
+      <w:pPr>
+        <w:tabs>
+          <w:tab w:val="num" w:pos="720"/>
+        </w:tabs>
+        <w:ind w:left="720" w:hanging="360"/>
+      </w:pPr>
+      <w:rPr>
+        <w:rFonts w:ascii="Symbol" w:hAnsi="Symbol" w:hint="default"/>
+        <w:sz w:val="20"/>
+      </w:rPr>
+    </w:lvl>
+    <w:lvl w:ilvl="1">
+      <w:start w:val="1"/>
+      <w:numFmt w:val="bullet"/>
+      <w:lvlText w:val="o"/>
+      <w:lvlJc w:val="left"/>
+      <w:pPr>
+        <w:tabs>
+          <w:tab w:val="num" w:pos="1440"/>
+        </w:tabs>
+        <w:ind w:left="1440" w:hanging="360"/>
+      </w:pPr>
+      <w:rPr>
+        <w:rFonts w:ascii="Courier New" w:hAnsi="Courier New" w:cs="Times New Roman" w:hint="default"/>
+        <w:sz w:val="20"/>
+      </w:rPr>
+    </w:lvl>
+    <w:lvl w:ilvl="2">
+      <w:start w:val="1"/>
+      <w:numFmt w:val="bullet"/>
+      <w:lvlText w:val=""/>
+      <w:lvlJc w:val="left"/>
+      <w:pPr>
+        <w:tabs>
+          <w:tab w:val="num" w:pos="2160"/>
+        </w:tabs>
+        <w:ind w:left="2160" w:hanging="360"/>
+      </w:pPr>
+      <w:rPr>
+        <w:rFonts w:ascii="Wingdings" w:hAnsi="Wingdings" w:hint="default"/>
+        <w:sz w:val="20"/>
+      </w:rPr>
+    </w:lvl>
+    <w:lvl w:ilvl="3">
+      <w:start w:val="1"/>
+      <w:numFmt w:val="bullet"/>
+      <w:lvlText w:val=""/>
+      <w:lvlJc w:val="left"/>
+      <w:pPr>
+        <w:tabs>
+          <w:tab w:val="num" w:pos="2880"/>
+        </w:tabs>
+        <w:ind w:left="2880" w:hanging="360"/>
+      </w:pPr>
+      <w:rPr>
+        <w:rFonts w:ascii="Wingdings" w:hAnsi="Wingdings" w:hint="default"/>
+        <w:sz w:val="20"/>
+      </w:rPr>
+    </w:lvl>
+    <w:lvl w:ilvl="4">
+      <w:start w:val="1"/>
+      <w:numFmt w:val="bullet"/>
+      <w:lvlText w:val=""/>
+      <w:lvlJc w:val="left"/>
+      <w:pPr>
+        <w:tabs>
+          <w:tab w:val="num" w:pos="3600"/>
+        </w:tabs>
+        <w:ind w:left="3600" w:hanging="360"/>
+      </w:pPr>
+      <w:rPr>
+        <w:rFonts w:ascii="Wingdings" w:hAnsi="Wingdings" w:hint="default"/>
+        <w:sz w:val="20"/>
+      </w:rPr>
+    </w:lvl>
+    <w:lvl w:ilvl="5">
+      <w:start w:val="1"/>
+      <w:numFmt w:val="bullet"/>
+      <w:lvlText w:val=""/>
+      <w:lvlJc w:val="left"/>
+      <w:pPr>
+        <w:tabs>
+          <w:tab w:val="num" w:pos="4320"/>
+        </w:tabs>
+        <w:ind w:left="4320" w:hanging="360"/>
+      </w:pPr>
+      <w:rPr>
+        <w:rFonts w:ascii="Wingdings" w:hAnsi="Wingdings" w:hint="default"/>
+        <w:sz w:val="20"/>
+      </w:rPr>
+    </w:lvl>
+    <w:lvl w:ilvl="6">
+      <w:start w:val="1"/>
+      <w:numFmt w:val="bullet"/>
+      <w:lvlText w:val=""/>
+      <w:lvlJc w:val="left"/>
+      <w:pPr>
+        <w:tabs>
+          <w:tab w:val="num" w:pos="5040"/>
+        </w:tabs>
+        <w:ind w:left="5040" w:hanging="360"/>
+      </w:pPr>
+      <w:rPr>
+        <w:rFonts w:ascii="Wingdings" w:hAnsi="Wingdings" w:hint="default"/>
+        <w:sz w:val="20"/>
+      </w:rPr>
+    </w:lvl>
+    <w:lvl w:ilvl="7">
+      <w:start w:val="1"/>
+      <w:numFmt w:val="bullet"/>
+      <w:lvlText w:val=""/>
+      <w:lvlJc w:val="left"/>
+      <w:pPr>
+        <w:tabs>
+          <w:tab w:val="num" w:pos="5760"/>
+        </w:tabs>
+        <w:ind w:left="5760" w:hanging="360"/>
+      </w:pPr>
+      <w:rPr>
+        <w:rFonts w:ascii="Wingdings" w:hAnsi="Wingdings" w:hint="default"/>
+        <w:sz w:val="20"/>
+      </w:rPr>
+    </w:lvl>
+    <w:lvl w:ilvl="8">
+      <w:start w:val="1"/>
+      <w:numFmt w:val="bullet"/>
+      <w:lvlText w:val=""/>
+      <w:lvlJc w:val="left"/>
+      <w:pPr>
+        <w:tabs>
+          <w:tab w:val="num" w:pos="6480"/>
+        </w:tabs>
+        <w:ind w:left="6480" w:hanging="360"/>
+      </w:pPr>
+      <w:rPr>
+        <w:rFonts w:ascii="Wingdings" w:hAnsi="Wingdings" w:hint="default"/>
+        <w:sz w:val="20"/>
+      </w:rPr>
+    </w:lvl>
+  </w:abstractNum>
+  <w:abstractNum w:abstractNumId="8" w15:restartNumberingAfterBreak="0">
     <w:nsid w:val="3E0F094B"/>
     <w:multiLevelType w:val="multilevel"/>
     <w:tmpl w:val="42BEFE4E"/>
@@ -2919,7 +5932,120 @@
       </w:rPr>
     </w:lvl>
   </w:abstractNum>
-  <w:abstractNum w:abstractNumId="6" w15:restartNumberingAfterBreak="0">
+  <w:abstractNum w:abstractNumId="9" w15:restartNumberingAfterBreak="0">
+    <w:nsid w:val="42335194"/>
+    <w:multiLevelType w:val="multilevel"/>
+    <w:tmpl w:val="ADDA18E2"/>
+    <w:lvl w:ilvl="0">
+      <w:start w:val="1"/>
+      <w:numFmt w:val="decimal"/>
+      <w:lvlText w:val="%1."/>
+      <w:lvlJc w:val="left"/>
+      <w:pPr>
+        <w:tabs>
+          <w:tab w:val="num" w:pos="720"/>
+        </w:tabs>
+        <w:ind w:left="720" w:hanging="360"/>
+      </w:pPr>
+    </w:lvl>
+    <w:lvl w:ilvl="1">
+      <w:start w:val="1"/>
+      <w:numFmt w:val="decimal"/>
+      <w:lvlText w:val="%2."/>
+      <w:lvlJc w:val="left"/>
+      <w:pPr>
+        <w:tabs>
+          <w:tab w:val="num" w:pos="1440"/>
+        </w:tabs>
+        <w:ind w:left="1440" w:hanging="360"/>
+      </w:pPr>
+    </w:lvl>
+    <w:lvl w:ilvl="2">
+      <w:start w:val="1"/>
+      <w:numFmt w:val="decimal"/>
+      <w:lvlText w:val="%3."/>
+      <w:lvlJc w:val="left"/>
+      <w:pPr>
+        <w:tabs>
+          <w:tab w:val="num" w:pos="2160"/>
+        </w:tabs>
+        <w:ind w:left="2160" w:hanging="360"/>
+      </w:pPr>
+    </w:lvl>
+    <w:lvl w:ilvl="3">
+      <w:start w:val="1"/>
+      <w:numFmt w:val="decimal"/>
+      <w:lvlText w:val="%4."/>
+      <w:lvlJc w:val="left"/>
+      <w:pPr>
+        <w:tabs>
+          <w:tab w:val="num" w:pos="2880"/>
+        </w:tabs>
+        <w:ind w:left="2880" w:hanging="360"/>
+      </w:pPr>
+    </w:lvl>
+    <w:lvl w:ilvl="4">
+      <w:start w:val="1"/>
+      <w:numFmt w:val="decimal"/>
+      <w:lvlText w:val="%5."/>
+      <w:lvlJc w:val="left"/>
+      <w:pPr>
+        <w:tabs>
+          <w:tab w:val="num" w:pos="3600"/>
+        </w:tabs>
+        <w:ind w:left="3600" w:hanging="360"/>
+      </w:pPr>
+    </w:lvl>
+    <w:lvl w:ilvl="5">
+      <w:start w:val="1"/>
+      <w:numFmt w:val="decimal"/>
+      <w:lvlText w:val="%6."/>
+      <w:lvlJc w:val="left"/>
+      <w:pPr>
+        <w:tabs>
+          <w:tab w:val="num" w:pos="4320"/>
+        </w:tabs>
+        <w:ind w:left="4320" w:hanging="360"/>
+      </w:pPr>
+    </w:lvl>
+    <w:lvl w:ilvl="6">
+      <w:start w:val="1"/>
+      <w:numFmt w:val="decimal"/>
+      <w:lvlText w:val="%7."/>
+      <w:lvlJc w:val="left"/>
+      <w:pPr>
+        <w:tabs>
+          <w:tab w:val="num" w:pos="5040"/>
+        </w:tabs>
+        <w:ind w:left="5040" w:hanging="360"/>
+      </w:pPr>
+    </w:lvl>
+    <w:lvl w:ilvl="7">
+      <w:start w:val="1"/>
+      <w:numFmt w:val="decimal"/>
+      <w:lvlText w:val="%8."/>
+      <w:lvlJc w:val="left"/>
+      <w:pPr>
+        <w:tabs>
+          <w:tab w:val="num" w:pos="5760"/>
+        </w:tabs>
+        <w:ind w:left="5760" w:hanging="360"/>
+      </w:pPr>
+    </w:lvl>
+    <w:lvl w:ilvl="8">
+      <w:start w:val="1"/>
+      <w:numFmt w:val="decimal"/>
+      <w:lvlText w:val="%9."/>
+      <w:lvlJc w:val="left"/>
+      <w:pPr>
+        <w:tabs>
+          <w:tab w:val="num" w:pos="6480"/>
+        </w:tabs>
+        <w:ind w:left="6480" w:hanging="360"/>
+      </w:pPr>
+    </w:lvl>
+  </w:abstractNum>
+  <w:abstractNum w:abstractNumId="10" w15:restartNumberingAfterBreak="0">
     <w:nsid w:val="5146317F"/>
     <w:multiLevelType w:val="multilevel"/>
     <w:tmpl w:val="162E2358"/>
@@ -3032,7 +6158,156 @@
       </w:pPr>
     </w:lvl>
   </w:abstractNum>
-  <w:abstractNum w:abstractNumId="7" w15:restartNumberingAfterBreak="0">
+  <w:abstractNum w:abstractNumId="11" w15:restartNumberingAfterBreak="0">
+    <w:nsid w:val="580F7ABB"/>
+    <w:multiLevelType w:val="multilevel"/>
+    <w:tmpl w:val="618465D8"/>
+    <w:lvl w:ilvl="0">
+      <w:start w:val="1"/>
+      <w:numFmt w:val="bullet"/>
+      <w:lvlText w:val=""/>
+      <w:lvlJc w:val="left"/>
+      <w:pPr>
+        <w:tabs>
+          <w:tab w:val="num" w:pos="720"/>
+        </w:tabs>
+        <w:ind w:left="720" w:hanging="360"/>
+      </w:pPr>
+      <w:rPr>
+        <w:rFonts w:ascii="Symbol" w:hAnsi="Symbol" w:hint="default"/>
+        <w:sz w:val="20"/>
+      </w:rPr>
+    </w:lvl>
+    <w:lvl w:ilvl="1">
+      <w:start w:val="1"/>
+      <w:numFmt w:val="bullet"/>
+      <w:lvlText w:val="o"/>
+      <w:lvlJc w:val="left"/>
+      <w:pPr>
+        <w:tabs>
+          <w:tab w:val="num" w:pos="1440"/>
+        </w:tabs>
+        <w:ind w:left="1440" w:hanging="360"/>
+      </w:pPr>
+      <w:rPr>
+        <w:rFonts w:ascii="Courier New" w:hAnsi="Courier New" w:cs="Times New Roman" w:hint="default"/>
+        <w:sz w:val="20"/>
+      </w:rPr>
+    </w:lvl>
+    <w:lvl w:ilvl="2">
+      <w:start w:val="1"/>
+      <w:numFmt w:val="bullet"/>
+      <w:lvlText w:val=""/>
+      <w:lvlJc w:val="left"/>
+      <w:pPr>
+        <w:tabs>
+          <w:tab w:val="num" w:pos="2160"/>
+        </w:tabs>
+        <w:ind w:left="2160" w:hanging="360"/>
+      </w:pPr>
+      <w:rPr>
+        <w:rFonts w:ascii="Wingdings" w:hAnsi="Wingdings" w:hint="default"/>
+        <w:sz w:val="20"/>
+      </w:rPr>
+    </w:lvl>
+    <w:lvl w:ilvl="3">
+      <w:start w:val="1"/>
+      <w:numFmt w:val="bullet"/>
+      <w:lvlText w:val=""/>
+      <w:lvlJc w:val="left"/>
+      <w:pPr>
+        <w:tabs>
+          <w:tab w:val="num" w:pos="2880"/>
+        </w:tabs>
+        <w:ind w:left="2880" w:hanging="360"/>
+      </w:pPr>
+      <w:rPr>
+        <w:rFonts w:ascii="Wingdings" w:hAnsi="Wingdings" w:hint="default"/>
+        <w:sz w:val="20"/>
+      </w:rPr>
+    </w:lvl>
+    <w:lvl w:ilvl="4">
+      <w:start w:val="1"/>
+      <w:numFmt w:val="bullet"/>
+      <w:lvlText w:val=""/>
+      <w:lvlJc w:val="left"/>
+      <w:pPr>
+        <w:tabs>
+          <w:tab w:val="num" w:pos="3600"/>
+        </w:tabs>
+        <w:ind w:left="3600" w:hanging="360"/>
+      </w:pPr>
+      <w:rPr>
+        <w:rFonts w:ascii="Wingdings" w:hAnsi="Wingdings" w:hint="default"/>
+        <w:sz w:val="20"/>
+      </w:rPr>
+    </w:lvl>
+    <w:lvl w:ilvl="5">
+      <w:start w:val="1"/>
+      <w:numFmt w:val="bullet"/>
+      <w:lvlText w:val=""/>
+      <w:lvlJc w:val="left"/>
+      <w:pPr>
+        <w:tabs>
+          <w:tab w:val="num" w:pos="4320"/>
+        </w:tabs>
+        <w:ind w:left="4320" w:hanging="360"/>
+      </w:pPr>
+      <w:rPr>
+        <w:rFonts w:ascii="Wingdings" w:hAnsi="Wingdings" w:hint="default"/>
+        <w:sz w:val="20"/>
+      </w:rPr>
+    </w:lvl>
+    <w:lvl w:ilvl="6">
+      <w:start w:val="1"/>
+      <w:numFmt w:val="bullet"/>
+      <w:lvlText w:val=""/>
+      <w:lvlJc w:val="left"/>
+      <w:pPr>
+        <w:tabs>
+          <w:tab w:val="num" w:pos="5040"/>
+        </w:tabs>
+        <w:ind w:left="5040" w:hanging="360"/>
+      </w:pPr>
+      <w:rPr>
+        <w:rFonts w:ascii="Wingdings" w:hAnsi="Wingdings" w:hint="default"/>
+        <w:sz w:val="20"/>
+      </w:rPr>
+    </w:lvl>
+    <w:lvl w:ilvl="7">
+      <w:start w:val="1"/>
+      <w:numFmt w:val="bullet"/>
+      <w:lvlText w:val=""/>
+      <w:lvlJc w:val="left"/>
+      <w:pPr>
+        <w:tabs>
+          <w:tab w:val="num" w:pos="5760"/>
+        </w:tabs>
+        <w:ind w:left="5760" w:hanging="360"/>
+      </w:pPr>
+      <w:rPr>
+        <w:rFonts w:ascii="Wingdings" w:hAnsi="Wingdings" w:hint="default"/>
+        <w:sz w:val="20"/>
+      </w:rPr>
+    </w:lvl>
+    <w:lvl w:ilvl="8">
+      <w:start w:val="1"/>
+      <w:numFmt w:val="bullet"/>
+      <w:lvlText w:val=""/>
+      <w:lvlJc w:val="left"/>
+      <w:pPr>
+        <w:tabs>
+          <w:tab w:val="num" w:pos="6480"/>
+        </w:tabs>
+        <w:ind w:left="6480" w:hanging="360"/>
+      </w:pPr>
+      <w:rPr>
+        <w:rFonts w:ascii="Wingdings" w:hAnsi="Wingdings" w:hint="default"/>
+        <w:sz w:val="20"/>
+      </w:rPr>
+    </w:lvl>
+  </w:abstractNum>
+  <w:abstractNum w:abstractNumId="12" w15:restartNumberingAfterBreak="0">
     <w:nsid w:val="59B23BBF"/>
     <w:multiLevelType w:val="multilevel"/>
     <w:tmpl w:val="902A1880"/>
@@ -3181,7 +6456,7 @@
       </w:rPr>
     </w:lvl>
   </w:abstractNum>
-  <w:abstractNum w:abstractNumId="8" w15:restartNumberingAfterBreak="0">
+  <w:abstractNum w:abstractNumId="13" w15:restartNumberingAfterBreak="0">
     <w:nsid w:val="5EBB66BF"/>
     <w:multiLevelType w:val="multilevel"/>
     <w:tmpl w:val="E070ABE4"/>
@@ -3331,13 +6606,13 @@
     </w:lvl>
   </w:abstractNum>
   <w:num w:numId="1" w16cid:durableId="940991906">
-    <w:abstractNumId w:val="3"/>
+    <w:abstractNumId w:val="4"/>
   </w:num>
   <w:num w:numId="2" w16cid:durableId="1247031297">
-    <w:abstractNumId w:val="5"/>
+    <w:abstractNumId w:val="8"/>
   </w:num>
   <w:num w:numId="3" w16cid:durableId="1856309981">
-    <w:abstractNumId w:val="8"/>
+    <w:abstractNumId w:val="13"/>
   </w:num>
   <w:num w:numId="4" w16cid:durableId="254049033">
     <w:abstractNumId w:val="2"/>
@@ -3349,13 +6624,91 @@
     <w:abstractNumId w:val="0"/>
   </w:num>
   <w:num w:numId="7" w16cid:durableId="411007589">
-    <w:abstractNumId w:val="4"/>
+    <w:abstractNumId w:val="6"/>
   </w:num>
   <w:num w:numId="8" w16cid:durableId="371350395">
-    <w:abstractNumId w:val="7"/>
+    <w:abstractNumId w:val="12"/>
   </w:num>
   <w:num w:numId="9" w16cid:durableId="450588312">
-    <w:abstractNumId w:val="6"/>
+    <w:abstractNumId w:val="10"/>
+  </w:num>
+  <w:num w:numId="10" w16cid:durableId="1205216793">
+    <w:abstractNumId w:val="7"/>
+    <w:lvlOverride w:ilvl="0"/>
+    <w:lvlOverride w:ilvl="1"/>
+    <w:lvlOverride w:ilvl="2"/>
+    <w:lvlOverride w:ilvl="3"/>
+    <w:lvlOverride w:ilvl="4"/>
+    <w:lvlOverride w:ilvl="5"/>
+    <w:lvlOverride w:ilvl="6"/>
+    <w:lvlOverride w:ilvl="7"/>
+    <w:lvlOverride w:ilvl="8"/>
+  </w:num>
+  <w:num w:numId="11" w16cid:durableId="939682991">
+    <w:abstractNumId w:val="5"/>
+    <w:lvlOverride w:ilvl="0"/>
+    <w:lvlOverride w:ilvl="1"/>
+    <w:lvlOverride w:ilvl="2"/>
+    <w:lvlOverride w:ilvl="3"/>
+    <w:lvlOverride w:ilvl="4"/>
+    <w:lvlOverride w:ilvl="5"/>
+    <w:lvlOverride w:ilvl="6"/>
+    <w:lvlOverride w:ilvl="7"/>
+    <w:lvlOverride w:ilvl="8"/>
+  </w:num>
+  <w:num w:numId="12" w16cid:durableId="2125222418">
+    <w:abstractNumId w:val="9"/>
+    <w:lvlOverride w:ilvl="0">
+      <w:startOverride w:val="1"/>
+    </w:lvlOverride>
+    <w:lvlOverride w:ilvl="1">
+      <w:startOverride w:val="1"/>
+    </w:lvlOverride>
+    <w:lvlOverride w:ilvl="2">
+      <w:startOverride w:val="1"/>
+    </w:lvlOverride>
+    <w:lvlOverride w:ilvl="3">
+      <w:startOverride w:val="1"/>
+    </w:lvlOverride>
+    <w:lvlOverride w:ilvl="4">
+      <w:startOverride w:val="1"/>
+    </w:lvlOverride>
+    <w:lvlOverride w:ilvl="5">
+      <w:startOverride w:val="1"/>
+    </w:lvlOverride>
+    <w:lvlOverride w:ilvl="6">
+      <w:startOverride w:val="1"/>
+    </w:lvlOverride>
+    <w:lvlOverride w:ilvl="7">
+      <w:startOverride w:val="1"/>
+    </w:lvlOverride>
+    <w:lvlOverride w:ilvl="8">
+      <w:startOverride w:val="1"/>
+    </w:lvlOverride>
+  </w:num>
+  <w:num w:numId="13" w16cid:durableId="1810856902">
+    <w:abstractNumId w:val="11"/>
+    <w:lvlOverride w:ilvl="0"/>
+    <w:lvlOverride w:ilvl="1"/>
+    <w:lvlOverride w:ilvl="2"/>
+    <w:lvlOverride w:ilvl="3"/>
+    <w:lvlOverride w:ilvl="4"/>
+    <w:lvlOverride w:ilvl="5"/>
+    <w:lvlOverride w:ilvl="6"/>
+    <w:lvlOverride w:ilvl="7"/>
+    <w:lvlOverride w:ilvl="8"/>
+  </w:num>
+  <w:num w:numId="14" w16cid:durableId="1130779729">
+    <w:abstractNumId w:val="3"/>
+    <w:lvlOverride w:ilvl="0"/>
+    <w:lvlOverride w:ilvl="1"/>
+    <w:lvlOverride w:ilvl="2"/>
+    <w:lvlOverride w:ilvl="3"/>
+    <w:lvlOverride w:ilvl="4"/>
+    <w:lvlOverride w:ilvl="5"/>
+    <w:lvlOverride w:ilvl="6"/>
+    <w:lvlOverride w:ilvl="7"/>
+    <w:lvlOverride w:ilvl="8"/>
   </w:num>
 </w:numbering>
 </file>

</xml_diff>